<commit_message>
docs: clean in-place update of PT Report Format san.docx and Review PPT Format san.pptx with zero template distortions
</commit_message>
<xml_diff>
--- a/PT Report Format san.docx
+++ b/PT Report Format san.docx
@@ -1069,7 +1069,7 @@
           <w:sz w:val="28"/>
           <w:szCs w:val="24"/>
         </w:rPr>
-        <w:t>4</w:t>
+        <w:t>6</w:t>
       </w:r>
     </w:p>
     <w:p>
@@ -1224,7 +1224,23 @@
           <w:rFonts w:ascii="Arial" w:hAnsi="Arial"/>
           <w:sz w:val="24"/>
         </w:rPr>
-        <w:t>This is to certify that this Professional Training Report is the bonafide work of student H Sanjai (44731076) who carried out the project entitled “SMART COMPLAINT &amp; GRIEVANCE REDRESSAL PORTAL” under my supervision from June 2026 to October 2026.</w:t>
+        <w:t xml:space="preserve">This is to certify that this Professional Training Report is the </w:t>
+      </w:r>
+      <w:proofErr w:type="spellStart"/>
+      <w:r>
+        <w:rPr>
+          <w:rFonts w:ascii="Arial" w:hAnsi="Arial"/>
+          <w:sz w:val="24"/>
+        </w:rPr>
+        <w:t>bonafide</w:t>
+      </w:r>
+      <w:proofErr w:type="spellEnd"/>
+      <w:r>
+        <w:rPr>
+          <w:rFonts w:ascii="Arial" w:hAnsi="Arial"/>
+          <w:sz w:val="24"/>
+        </w:rPr>
+        <w:t xml:space="preserve"> work of student H Sanjai (44731076) who carried out the project entitled “SMART COMPLAINT &amp; GRIEVANCE REDRESSAL PORTAL” under my supervision from June 2026 to October 2026.</w:t>
       </w:r>
     </w:p>
     <w:p>
@@ -1312,13 +1328,22 @@
           <w:rFonts w:ascii="Arial" w:hAnsi="Arial" w:cs="Arial"/>
           <w:b/>
         </w:rPr>
-        <w:t xml:space="preserve"> R. Shanumgaa</w:t>
-      </w:r>
+        <w:t xml:space="preserve"> R. </w:t>
+      </w:r>
+      <w:proofErr w:type="spellStart"/>
       <w:r>
         <w:rPr>
           <w:rFonts w:ascii="Arial" w:hAnsi="Arial" w:cs="Arial"/>
           <w:b/>
         </w:rPr>
+        <w:t>Shanumgaa</w:t>
+      </w:r>
+      <w:proofErr w:type="spellEnd"/>
+      <w:r>
+        <w:rPr>
+          <w:rFonts w:ascii="Arial" w:hAnsi="Arial" w:cs="Arial"/>
+          <w:b/>
+        </w:rPr>
         <w:t xml:space="preserve"> </w:t>
       </w:r>
       <w:r>
@@ -1328,6 +1353,7 @@
         </w:rPr>
         <w:t>Priya</w:t>
       </w:r>
+      <w:proofErr w:type="gramStart"/>
       <w:r>
         <w:rPr>
           <w:rFonts w:ascii="Arial" w:hAnsi="Arial" w:cs="Arial"/>
@@ -1335,6 +1361,7 @@
         </w:rPr>
         <w:t>, ,</w:t>
       </w:r>
+      <w:proofErr w:type="gramEnd"/>
     </w:p>
     <w:p>
       <w:pPr>
@@ -1858,7 +1885,23 @@
           <w:rFonts w:ascii="Arial" w:hAnsi="Arial"/>
           <w:sz w:val="24"/>
         </w:rPr>
-        <w:t>I, H Sanjai (44731076), hereby declare that the Professional Training Report-I entitled “SMART COMPLAINT &amp; GRIEVANCE REDRESSAL PORTAL” done by me under the guidance of Ms. R. Shanumgaa Priya, is submitted in partial fulfilment of the requirements for the award of Bachelor of Engineering degree in Computer Science and Engineering with specialization in Artificial Intelligence.</w:t>
+        <w:t xml:space="preserve">I, H Sanjai (44731076), hereby declare that the Professional Training Report-I entitled “SMART COMPLAINT &amp; GRIEVANCE REDRESSAL PORTAL” done by me under the guidance of Ms. R. </w:t>
+      </w:r>
+      <w:proofErr w:type="spellStart"/>
+      <w:r>
+        <w:rPr>
+          <w:rFonts w:ascii="Arial" w:hAnsi="Arial"/>
+          <w:sz w:val="24"/>
+        </w:rPr>
+        <w:t>Shanumgaa</w:t>
+      </w:r>
+      <w:proofErr w:type="spellEnd"/>
+      <w:r>
+        <w:rPr>
+          <w:rFonts w:ascii="Arial" w:hAnsi="Arial"/>
+          <w:sz w:val="24"/>
+        </w:rPr>
+        <w:t xml:space="preserve"> Priya, is submitted in partial fulfilment of the requirements for the award of Bachelor of Engineering degree in Computer Science and Engineering with specialization in Artificial Intelligence.</w:t>
       </w:r>
     </w:p>
     <w:p>
@@ -2453,7 +2496,25 @@
           <w:sz w:val="24"/>
           <w:szCs w:val="24"/>
         </w:rPr>
-        <w:t xml:space="preserve">, School of Computing,                          </w:t>
+        <w:t xml:space="preserve">, School of </w:t>
+      </w:r>
+      <w:proofErr w:type="gramStart"/>
+      <w:r>
+        <w:rPr>
+          <w:rFonts w:ascii="Arial" w:hAnsi="Arial" w:cs="Arial"/>
+          <w:sz w:val="24"/>
+          <w:szCs w:val="24"/>
+        </w:rPr>
+        <w:t xml:space="preserve">Computing,   </w:t>
+      </w:r>
+      <w:proofErr w:type="gramEnd"/>
+      <w:r>
+        <w:rPr>
+          <w:rFonts w:ascii="Arial" w:hAnsi="Arial" w:cs="Arial"/>
+          <w:sz w:val="24"/>
+          <w:szCs w:val="24"/>
+        </w:rPr>
+        <w:t xml:space="preserve">                       </w:t>
       </w:r>
       <w:r>
         <w:rPr>
@@ -2576,7 +2637,23 @@
           <w:rFonts w:ascii="Arial" w:hAnsi="Arial" w:cs="Arial"/>
           <w:b/>
         </w:rPr>
-        <w:t>Ms. R. Shanumgaa Priya</w:t>
+        <w:t xml:space="preserve">Ms. R. </w:t>
+      </w:r>
+      <w:proofErr w:type="spellStart"/>
+      <w:r>
+        <w:rPr>
+          <w:rFonts w:ascii="Arial" w:hAnsi="Arial" w:cs="Arial"/>
+          <w:b/>
+        </w:rPr>
+        <w:t>Shanumgaa</w:t>
+      </w:r>
+      <w:proofErr w:type="spellEnd"/>
+      <w:r>
+        <w:rPr>
+          <w:rFonts w:ascii="Arial" w:hAnsi="Arial" w:cs="Arial"/>
+          <w:b/>
+        </w:rPr>
+        <w:t xml:space="preserve"> Priya</w:t>
       </w:r>
       <w:r>
         <w:rPr>
@@ -2818,17 +2895,6 @@
         <w:jc w:val="center"/>
         <w:rPr>
           <w:rFonts w:cstheme="minorHAnsi"/>
-          <w:sz w:val="24"/>
-        </w:rPr>
-      </w:pPr>
-    </w:p>
-    <w:p>
-      <w:pPr>
-        <w:spacing w:before="197" w:line="360" w:lineRule="auto"/>
-        <w:ind w:right="-2" w:hanging="10"/>
-        <w:jc w:val="center"/>
-        <w:rPr>
-          <w:rFonts w:cstheme="minorHAnsi"/>
           <w:b/>
           <w:sz w:val="28"/>
           <w:szCs w:val="28"/>
@@ -2841,7 +2907,8 @@
           <w:sz w:val="28"/>
           <w:szCs w:val="28"/>
         </w:rPr>
-        <w:t>COURSE CERTIFICATE</w:t>
+        <w:lastRenderedPageBreak/>
+        <w:t>URSE CERTIFICATE</w:t>
       </w:r>
     </w:p>
     <w:p>
@@ -2897,7 +2964,7 @@
           <w:lang w:eastAsia="en-IN"/>
         </w:rPr>
         <w:drawing>
-          <wp:inline distT="0" distB="0" distL="0" distR="0" wp14:anchorId="631B0CA8" wp14:editId="45D0EB98">
+          <wp:inline distT="0" distB="0" distL="0" distR="0" wp14:anchorId="631B0CA8" wp14:editId="1D4AAFD9">
             <wp:extent cx="5759450" cy="4403090"/>
             <wp:effectExtent l="0" t="0" r="0" b="0"/>
             <wp:docPr id="1" name="Picture 1"/>
@@ -4530,7 +4597,6 @@
           <w:b/>
           <w:sz w:val="28"/>
         </w:rPr>
-        <w:lastRenderedPageBreak/>
         <w:t>ABSTRACT</w:t>
       </w:r>
     </w:p>
@@ -4545,15 +4611,8 @@
           <w:color w:val="000000"/>
           <w:sz w:val="24"/>
         </w:rPr>
-        <w:t xml:space="preserve">Higher educational campuses accommodate tens of thousands of active stakeholders including undergraduate and postgraduate students, research scholars, resident hostel inmates, faculty, and administrative staff. In traditional campus operating environments, grievance redressal is notoriously fragmented across physical suggestion boxes, informal verbal reports, ad-hoc WhatsApp messaging, and unorganized email threads. As an inevitable consequence, student grievances suffer from a complete absence of tracking </w:t>
-      </w:r>
-      <w:r>
-        <w:rPr>
-          <w:rFonts w:ascii="Arial" w:hAnsi="Arial"/>
-          <w:color w:val="000000"/>
-          <w:sz w:val="24"/>
-        </w:rPr>
-        <w:t>visibility, arbitrary resolution claims by maintenance personnel, and an absolute deficiency of Service Level Agreement (SLA) accountability.</w:t>
+        <w:lastRenderedPageBreak/>
+        <w:t>Higher educational campuses accommodate tens of thousands of active stakeholders including undergraduate and postgraduate students, research scholars, resident hostel inmates, faculty, and administrative staff. In traditional campus operating environments, grievance redressal is notoriously fragmented across physical suggestion boxes, informal verbal reports, ad-hoc WhatsApp messaging, and unorganized email threads. As an inevitable consequence, student grievances suffer from a complete absence of tracking visibility, arbitrary resolution claims by maintenance personnel, and an absolute deficiency of Service Level Agreement (SLA) accountability.</w:t>
       </w:r>
     </w:p>
     <w:p>
@@ -4567,15 +4626,7 @@
           <w:color w:val="000000"/>
           <w:sz w:val="24"/>
         </w:rPr>
-        <w:t>This project presents the Smart Complaint &amp; Grievance Redressal Portal, an enterprise-grade, lightweight, three-tier web application engineered using native Java SE 21, MySQL 8.0 relational database architecture, and responsive semantic web standards. The proposed system introduces three transformative engineering innovations: (1) an automated priority matrix and real-time 48-hour SLA countdown timer visible to both students and authorities, (2) an algorithmic multi-tier background escalation engine that au</w:t>
-      </w:r>
-      <w:r>
-        <w:rPr>
-          <w:rFonts w:ascii="Arial" w:hAnsi="Arial"/>
-          <w:color w:val="000000"/>
-          <w:sz w:val="24"/>
-        </w:rPr>
-        <w:t>tomatically reassigns unattended grievances from the Staff Coordinator to the Head of Department (HOD) at 24 hours and the Dean at 48 hours, and (3) a closed-loop governance protocol enforcing an anti-bypass state lock wherein a grievance cannot transition to RESOLVED until the filing student validates the completed repair through an authenticated 1-to-5 star rating.</w:t>
+        <w:t>This project presents the Smart Complaint &amp; Grievance Redressal Portal, an enterprise-grade, lightweight, three-tier web application engineered using native Java SE 21, MySQL 8.0 relational database architecture, and responsive semantic web standards. The proposed system introduces three transformative engineering innovations: (1) an automated priority matrix and real-time 48-hour SLA countdown timer visible to both students and authorities, (2) an algorithmic multi-tier background escalation engine that automatically reassigns unattended grievances from the Staff Coordinator to the Head of Department (HOD) at 24 hours and the Dean at 48 hours, and (3) a closed-loop governance protocol enforcing an anti-bypass state lock wherein a grievance cannot transition to RESOLVED until the filing student validates the completed repair through an authenticated 1-to-5 star rating.</w:t>
       </w:r>
     </w:p>
     <w:p>
@@ -4589,15 +4640,97 @@
           <w:color w:val="000000"/>
           <w:sz w:val="24"/>
         </w:rPr>
-        <w:t>To maximize runtime efficiency and illustrate deep systems-level mastery, the application avoids bulky third-party starter frameworks (such as Spring Boot), instead leveraging Java SE's built-in HttpServer with raw JDBC connection pooling and BCrypt password encryption (work factor 12). The relational database is normalized strictly in Third Normal Form (3NF) to guarantee ACID transactional consistency. Furthermore, an in-browser HTML5 canvas downsampling pipeline reduces mobile camera photo payloads by ove</w:t>
-      </w:r>
+        <w:t xml:space="preserve">To maximize runtime efficiency and illustrate deep systems-level mastery, the application avoids bulky third-party starter frameworks (such as Spring Boot), instead leveraging Java SE's built-in </w:t>
+      </w:r>
+      <w:proofErr w:type="spellStart"/>
       <w:r>
         <w:rPr>
           <w:rFonts w:ascii="Arial" w:hAnsi="Arial"/>
           <w:color w:val="000000"/>
           <w:sz w:val="24"/>
         </w:rPr>
-        <w:t>r 98% (from 8+ MB to under 120 KB) prior to database persistence. Extensive empirical testing confirms a cold-start initialization latency of 380 ms, average API retrieval times under 12 ms, and 100% adherence to institutional SLA deadlines.</w:t>
+        <w:t>HttpServer</w:t>
+      </w:r>
+      <w:proofErr w:type="spellEnd"/>
+      <w:r>
+        <w:rPr>
+          <w:rFonts w:ascii="Arial" w:hAnsi="Arial"/>
+          <w:color w:val="000000"/>
+          <w:sz w:val="24"/>
+        </w:rPr>
+        <w:t xml:space="preserve"> with raw JDBC connection pooling and </w:t>
+      </w:r>
+      <w:proofErr w:type="spellStart"/>
+      <w:r>
+        <w:rPr>
+          <w:rFonts w:ascii="Arial" w:hAnsi="Arial"/>
+          <w:color w:val="000000"/>
+          <w:sz w:val="24"/>
+        </w:rPr>
+        <w:t>BCrypt</w:t>
+      </w:r>
+      <w:proofErr w:type="spellEnd"/>
+      <w:r>
+        <w:rPr>
+          <w:rFonts w:ascii="Arial" w:hAnsi="Arial"/>
+          <w:color w:val="000000"/>
+          <w:sz w:val="24"/>
+        </w:rPr>
+        <w:t xml:space="preserve"> password encryption (work factor 12). The relational database is normalized strictly in Third Normal Form (3NF) to guarantee ACID transactional consistency. Furthermore, an in-browser HTML5 canvas </w:t>
+      </w:r>
+      <w:proofErr w:type="spellStart"/>
+      <w:r>
+        <w:rPr>
+          <w:rFonts w:ascii="Arial" w:hAnsi="Arial"/>
+          <w:color w:val="000000"/>
+          <w:sz w:val="24"/>
+        </w:rPr>
+        <w:t>downsampling</w:t>
+      </w:r>
+      <w:proofErr w:type="spellEnd"/>
+      <w:r>
+        <w:rPr>
+          <w:rFonts w:ascii="Arial" w:hAnsi="Arial"/>
+          <w:color w:val="000000"/>
+          <w:sz w:val="24"/>
+        </w:rPr>
+        <w:t xml:space="preserve"> pipeline reduces mobile camera photo payloads by over 98% (from 8+ MB to under 120 KB) prior to database persistence. Extensive empirical testing confirms a cold-start initialization latency of 380 </w:t>
+      </w:r>
+      <w:proofErr w:type="spellStart"/>
+      <w:r>
+        <w:rPr>
+          <w:rFonts w:ascii="Arial" w:hAnsi="Arial"/>
+          <w:color w:val="000000"/>
+          <w:sz w:val="24"/>
+        </w:rPr>
+        <w:t>ms</w:t>
+      </w:r>
+      <w:proofErr w:type="spellEnd"/>
+      <w:r>
+        <w:rPr>
+          <w:rFonts w:ascii="Arial" w:hAnsi="Arial"/>
+          <w:color w:val="000000"/>
+          <w:sz w:val="24"/>
+        </w:rPr>
+        <w:t xml:space="preserve">, average API retrieval times under 12 </w:t>
+      </w:r>
+      <w:proofErr w:type="spellStart"/>
+      <w:r>
+        <w:rPr>
+          <w:rFonts w:ascii="Arial" w:hAnsi="Arial"/>
+          <w:color w:val="000000"/>
+          <w:sz w:val="24"/>
+        </w:rPr>
+        <w:t>ms</w:t>
+      </w:r>
+      <w:proofErr w:type="spellEnd"/>
+      <w:r>
+        <w:rPr>
+          <w:rFonts w:ascii="Arial" w:hAnsi="Arial"/>
+          <w:color w:val="000000"/>
+          <w:sz w:val="24"/>
+        </w:rPr>
+        <w:t>, and 100% adherence to institutional SLA deadlines.</w:t>
       </w:r>
     </w:p>
     <w:p>
@@ -4613,7 +4746,51 @@
           <w:color w:val="000000"/>
           <w:sz w:val="24"/>
         </w:rPr>
-        <w:t>Campus Grievance Redressal, 3-Tier Architecture, Java SE 21 HttpServer, MySQL 3NF, SLA Auto-Escalation, Closed-Loop Rating, BCrypt Cryptography.</w:t>
+        <w:t xml:space="preserve">Campus Grievance Redressal, 3-Tier Architecture, Java SE 21 </w:t>
+      </w:r>
+      <w:proofErr w:type="spellStart"/>
+      <w:r>
+        <w:rPr>
+          <w:rFonts w:ascii="Arial" w:hAnsi="Arial"/>
+          <w:b/>
+          <w:i/>
+          <w:color w:val="000000"/>
+          <w:sz w:val="24"/>
+        </w:rPr>
+        <w:t>HttpServer</w:t>
+      </w:r>
+      <w:proofErr w:type="spellEnd"/>
+      <w:r>
+        <w:rPr>
+          <w:rFonts w:ascii="Arial" w:hAnsi="Arial"/>
+          <w:b/>
+          <w:i/>
+          <w:color w:val="000000"/>
+          <w:sz w:val="24"/>
+        </w:rPr>
+        <w:t xml:space="preserve">, MySQL 3NF, SLA Auto-Escalation, Closed-Loop Rating, </w:t>
+      </w:r>
+      <w:proofErr w:type="spellStart"/>
+      <w:r>
+        <w:rPr>
+          <w:rFonts w:ascii="Arial" w:hAnsi="Arial"/>
+          <w:b/>
+          <w:i/>
+          <w:color w:val="000000"/>
+          <w:sz w:val="24"/>
+        </w:rPr>
+        <w:t>BCrypt</w:t>
+      </w:r>
+      <w:proofErr w:type="spellEnd"/>
+      <w:r>
+        <w:rPr>
+          <w:rFonts w:ascii="Arial" w:hAnsi="Arial"/>
+          <w:b/>
+          <w:i/>
+          <w:color w:val="000000"/>
+          <w:sz w:val="24"/>
+        </w:rPr>
+        <w:t xml:space="preserve"> Cryptography.</w:t>
       </w:r>
     </w:p>
     <w:p>
@@ -4788,6 +4965,7 @@
               <w:spacing w:after="40"/>
               <w:jc w:val="right"/>
             </w:pPr>
+            <w:proofErr w:type="spellStart"/>
             <w:r>
               <w:rPr>
                 <w:rFonts w:ascii="Arial" w:hAnsi="Arial"/>
@@ -4796,6 +4974,7 @@
               </w:rPr>
               <w:t>i</w:t>
             </w:r>
+            <w:proofErr w:type="spellEnd"/>
           </w:p>
         </w:tc>
       </w:tr>
@@ -7173,7 +7352,23 @@
                 <w:rFonts w:ascii="Arial" w:hAnsi="Arial"/>
                 <w:sz w:val="19"/>
               </w:rPr>
-              <w:t>Working Principles (SLA Timers, Escalation Engine, Canvas Downsampling)</w:t>
+              <w:t xml:space="preserve">Working Principles (SLA Timers, Escalation Engine, Canvas </w:t>
+            </w:r>
+            <w:proofErr w:type="spellStart"/>
+            <w:r>
+              <w:rPr>
+                <w:rFonts w:ascii="Arial" w:hAnsi="Arial"/>
+                <w:sz w:val="19"/>
+              </w:rPr>
+              <w:t>Downsampling</w:t>
+            </w:r>
+            <w:proofErr w:type="spellEnd"/>
+            <w:r>
+              <w:rPr>
+                <w:rFonts w:ascii="Arial" w:hAnsi="Arial"/>
+                <w:sz w:val="19"/>
+              </w:rPr>
+              <w:t>)</w:t>
             </w:r>
           </w:p>
         </w:tc>
@@ -8512,7 +8707,7 @@
                 <w:rFonts w:ascii="Arial" w:hAnsi="Arial"/>
                 <w:sz w:val="20"/>
               </w:rPr>
-              <w:t>31</w:t>
+              <w:t>27</w:t>
             </w:r>
           </w:p>
         </w:tc>
@@ -8597,15 +8792,7 @@
           <w:color w:val="000000"/>
           <w:sz w:val="24"/>
         </w:rPr>
-        <w:t>Modern university ecosystems such as Sathyabama Institute of Science and Technology (SIST) function as complex micro-cities, housing tens of thousands of individuals across multi-acre academic campuses. Daily operations encompass dozens of multi-story faculty blocks, sophisticated computing and artificial intelligence research laboratories, residential hostels accommodating thousands of undergraduate and postgraduate students, dining facilities, health clinics, Wi-Fi networks, and university transit systems</w:t>
-      </w:r>
-      <w:r>
-        <w:rPr>
-          <w:rFonts w:ascii="Arial" w:hAnsi="Arial"/>
-          <w:color w:val="000000"/>
-          <w:sz w:val="24"/>
-        </w:rPr>
-        <w:t>.</w:t>
+        <w:t>Modern university ecosystems such as Sathyabama Institute of Science and Technology (SIST) function as complex micro-cities, housing tens of thousands of individuals across multi-acre academic campuses. Daily operations encompass dozens of multi-story faculty blocks, sophisticated computing and artificial intelligence research laboratories, residential hostels accommodating thousands of undergraduate and postgraduate students, dining facilities, health clinics, Wi-Fi networks, and university transit systems.</w:t>
       </w:r>
     </w:p>
     <w:p>
@@ -8619,15 +8806,25 @@
           <w:color w:val="000000"/>
           <w:sz w:val="24"/>
         </w:rPr>
-        <w:t>Within an environment of this magnitude, continuous wear and tear, operational friction, and logistical failures are routine. Typical campus incidents range from localized infrastructure breakdowns (such as air conditioning failures in specialized AI laboratories, water pump defects in residential blocks, and damaged projectors in lecture theaters) to administrative disputes concerning examination scheduling, canteen hygiene, and disciplinary conflicts. Rapid, transparent, and verified resolution of these i</w:t>
-      </w:r>
+        <w:t xml:space="preserve">Within an environment of this magnitude, continuous wear and tear, operational friction, and logistical failures are routine. Typical campus incidents range from localized infrastructure breakdowns (such as air conditioning failures in specialized AI laboratories, water pump defects in residential blocks, and damaged projectors in lecture </w:t>
+      </w:r>
+      <w:proofErr w:type="spellStart"/>
       <w:r>
         <w:rPr>
           <w:rFonts w:ascii="Arial" w:hAnsi="Arial"/>
           <w:color w:val="000000"/>
           <w:sz w:val="24"/>
         </w:rPr>
-        <w:t>ncidents is paramount. Unresolved grievances not only degrade the learning environment and student morale but also adversely impact national accreditation metrics (such as NAAC, NBA, and NIRF rankings), which mandate formal student grievance redressal mechanisms with auditable turnaround benchmarks.</w:t>
+        <w:t>theaters</w:t>
+      </w:r>
+      <w:proofErr w:type="spellEnd"/>
+      <w:r>
+        <w:rPr>
+          <w:rFonts w:ascii="Arial" w:hAnsi="Arial"/>
+          <w:color w:val="000000"/>
+          <w:sz w:val="24"/>
+        </w:rPr>
+        <w:t>) to administrative disputes concerning examination scheduling, canteen hygiene, and disciplinary conflicts. Rapid, transparent, and verified resolution of these incidents is paramount. Unresolved grievances not only degrade the learning environment and student morale but also adversely impact national accreditation metrics (such as NAAC, NBA, and NIRF rankings), which mandate formal student grievance redressal mechanisms with auditable turnaround benchmarks.</w:t>
       </w:r>
     </w:p>
     <w:p>
@@ -8656,15 +8853,7 @@
           <w:color w:val="000000"/>
           <w:sz w:val="24"/>
         </w:rPr>
-        <w:t xml:space="preserve">Over the past decade, university classrooms have witnessed massive digital transformation through interactive smartboards, virtual laboratory environments, and cloud-based learning management systems (LMS). Paradoxically, administrative support services and student grievance handling have remained largely archaic. Students are frequently compelled to navigate labyrinthine bureaucratic pathways, submit paper complaints into physical drop boxes, or broadcast informal messages over unmonitored WhatsApp groups </w:t>
-      </w:r>
-      <w:r>
-        <w:rPr>
-          <w:rFonts w:ascii="Arial" w:hAnsi="Arial"/>
-          <w:color w:val="000000"/>
-          <w:sz w:val="24"/>
-        </w:rPr>
-        <w:t>and social media channels.</w:t>
+        <w:t>Over the past decade, university classrooms have witnessed massive digital transformation through interactive smartboards, virtual laboratory environments, and cloud-based learning management systems (LMS). Paradoxically, administrative support services and student grievance handling have remained largely archaic. Students are frequently compelled to navigate labyrinthine bureaucratic pathways, submit paper complaints into physical drop boxes, or broadcast informal messages over unmonitored WhatsApp groups and social media channels.</w:t>
       </w:r>
     </w:p>
     <w:p>
@@ -8678,15 +8867,25 @@
           <w:color w:val="000000"/>
           <w:sz w:val="24"/>
         </w:rPr>
-        <w:t>This dissonance between cutting-edge pedagogical technology and obsolete administrative workflows serves as the primary catalyst for this capstone project. By applying software engineering rigor—specifically lightweight 3-tier architectural decoupling, strict Third Normal Form (3NF) relational database modeling, cryptographic security, and asynchronous daemon-driven process automation—this project demonstrates that a university grievance portal can be built to enforce absolute operational transparency and g</w:t>
-      </w:r>
+        <w:t xml:space="preserve">This dissonance between cutting-edge pedagogical technology and obsolete administrative workflows serves as the primary catalyst for this capstone project. By applying software engineering rigor—specifically lightweight 3-tier architectural decoupling, strict Third Normal Form (3NF) relational database </w:t>
+      </w:r>
+      <w:proofErr w:type="spellStart"/>
       <w:r>
         <w:rPr>
           <w:rFonts w:ascii="Arial" w:hAnsi="Arial"/>
           <w:color w:val="000000"/>
           <w:sz w:val="24"/>
         </w:rPr>
-        <w:t>uaranteed 48-hour resolution compliance.</w:t>
+        <w:t>modeling</w:t>
+      </w:r>
+      <w:proofErr w:type="spellEnd"/>
+      <w:r>
+        <w:rPr>
+          <w:rFonts w:ascii="Arial" w:hAnsi="Arial"/>
+          <w:color w:val="000000"/>
+          <w:sz w:val="24"/>
+        </w:rPr>
+        <w:t>, cryptographic security, and asynchronous daemon-driven process automation—this project demonstrates that a university grievance portal can be built to enforce absolute operational transparency and guaranteed 48-hour resolution compliance.</w:t>
       </w:r>
     </w:p>
     <w:p>
@@ -8963,7 +9162,25 @@
           <w:color w:val="000000"/>
           <w:sz w:val="23"/>
         </w:rPr>
-        <w:t>Develop a lean, high-throughput REST backend in pure Java SE 21 using native HttpServer, achieving sub-second process startup and zero dependency on bloated third-party frameworks.</w:t>
+        <w:t xml:space="preserve">Develop a lean, high-throughput REST backend in pure Java SE 21 using native </w:t>
+      </w:r>
+      <w:proofErr w:type="spellStart"/>
+      <w:r>
+        <w:rPr>
+          <w:rFonts w:ascii="Arial" w:hAnsi="Arial"/>
+          <w:color w:val="000000"/>
+          <w:sz w:val="23"/>
+        </w:rPr>
+        <w:t>HttpServer</w:t>
+      </w:r>
+      <w:proofErr w:type="spellEnd"/>
+      <w:r>
+        <w:rPr>
+          <w:rFonts w:ascii="Arial" w:hAnsi="Arial"/>
+          <w:color w:val="000000"/>
+          <w:sz w:val="23"/>
+        </w:rPr>
+        <w:t>, achieving sub-second process startup and zero dependency on bloated third-party frameworks.</w:t>
       </w:r>
     </w:p>
     <w:p>
@@ -8996,7 +9213,25 @@
           <w:color w:val="000000"/>
           <w:sz w:val="23"/>
         </w:rPr>
-        <w:t>Implement an automated 48-hour SLA governance engine backed by a multi-threaded ScheduledExecutorService daemon that autonomously escalates neglected tickets from Coordinator to HOD and Dean.</w:t>
+        <w:t xml:space="preserve">Implement an automated 48-hour SLA governance engine backed by a multi-threaded </w:t>
+      </w:r>
+      <w:proofErr w:type="spellStart"/>
+      <w:r>
+        <w:rPr>
+          <w:rFonts w:ascii="Arial" w:hAnsi="Arial"/>
+          <w:color w:val="000000"/>
+          <w:sz w:val="23"/>
+        </w:rPr>
+        <w:t>ScheduledExecutorService</w:t>
+      </w:r>
+      <w:proofErr w:type="spellEnd"/>
+      <w:r>
+        <w:rPr>
+          <w:rFonts w:ascii="Arial" w:hAnsi="Arial"/>
+          <w:color w:val="000000"/>
+          <w:sz w:val="23"/>
+        </w:rPr>
+        <w:t xml:space="preserve"> daemon that autonomously escalates neglected tickets from Coordinator to HOD and Dean.</w:t>
       </w:r>
     </w:p>
     <w:p>
@@ -9029,7 +9264,43 @@
           <w:color w:val="000000"/>
           <w:sz w:val="23"/>
         </w:rPr>
-        <w:t>Model an ACID-compliant MySQL relational database in Third Normal Form (3NF) with parameterized PreparedStatements and BCrypt password salting (work factor 12).</w:t>
+        <w:t xml:space="preserve">Model an ACID-compliant MySQL relational database in Third Normal Form (3NF) with parameterized </w:t>
+      </w:r>
+      <w:proofErr w:type="spellStart"/>
+      <w:r>
+        <w:rPr>
+          <w:rFonts w:ascii="Arial" w:hAnsi="Arial"/>
+          <w:color w:val="000000"/>
+          <w:sz w:val="23"/>
+        </w:rPr>
+        <w:t>PreparedStatements</w:t>
+      </w:r>
+      <w:proofErr w:type="spellEnd"/>
+      <w:r>
+        <w:rPr>
+          <w:rFonts w:ascii="Arial" w:hAnsi="Arial"/>
+          <w:color w:val="000000"/>
+          <w:sz w:val="23"/>
+        </w:rPr>
+        <w:t xml:space="preserve"> and </w:t>
+      </w:r>
+      <w:proofErr w:type="spellStart"/>
+      <w:r>
+        <w:rPr>
+          <w:rFonts w:ascii="Arial" w:hAnsi="Arial"/>
+          <w:color w:val="000000"/>
+          <w:sz w:val="23"/>
+        </w:rPr>
+        <w:t>BCrypt</w:t>
+      </w:r>
+      <w:proofErr w:type="spellEnd"/>
+      <w:r>
+        <w:rPr>
+          <w:rFonts w:ascii="Arial" w:hAnsi="Arial"/>
+          <w:color w:val="000000"/>
+          <w:sz w:val="23"/>
+        </w:rPr>
+        <w:t xml:space="preserve"> password salting (work factor 12).</w:t>
       </w:r>
     </w:p>
     <w:p>
@@ -9062,7 +9333,25 @@
           <w:color w:val="000000"/>
           <w:sz w:val="23"/>
         </w:rPr>
-        <w:t>Enforce an anti-bypass closed-loop protocol where grievances cannot transition to RESOLVED until the submitting student validates the repair with an authenticated 1-to-5 star rating.</w:t>
+        <w:t>Enforce an anti-bypass closed-loop protocol where grievances cannot transition to RESOLVED until the submitting student validates the repair with an authenticated 1-to-</w:t>
+      </w:r>
+      <w:proofErr w:type="gramStart"/>
+      <w:r>
+        <w:rPr>
+          <w:rFonts w:ascii="Arial" w:hAnsi="Arial"/>
+          <w:color w:val="000000"/>
+          <w:sz w:val="23"/>
+        </w:rPr>
+        <w:t>5 star</w:t>
+      </w:r>
+      <w:proofErr w:type="gramEnd"/>
+      <w:r>
+        <w:rPr>
+          <w:rFonts w:ascii="Arial" w:hAnsi="Arial"/>
+          <w:color w:val="000000"/>
+          <w:sz w:val="23"/>
+        </w:rPr>
+        <w:t xml:space="preserve"> rating.</w:t>
       </w:r>
     </w:p>
     <w:p>
@@ -9154,15 +9443,7 @@
           <w:color w:val="000000"/>
           <w:sz w:val="24"/>
         </w:rPr>
-        <w:t>The remainder of this report is organized as follows: Chapter 2 reviews relevant academic and industry literature on campus helpdesks and SLA automation. Chapter 3 establishes formal requirement specifications, user personas, and Agile SDLC methodologies. Chapter 4 details system architecture, 3NF database design, and algorithmic working principles. Chapter 5 presents empirical results, benchmark evaluations, and engineering bug resolutions. Finally, Chapter 6 concludes the report with key learnings and fut</w:t>
-      </w:r>
-      <w:r>
-        <w:rPr>
-          <w:rFonts w:ascii="Arial" w:hAnsi="Arial"/>
-          <w:color w:val="000000"/>
-          <w:sz w:val="24"/>
-        </w:rPr>
-        <w:t>ure artificial intelligence enhancements.</w:t>
+        <w:t>The remainder of this report is organized as follows: Chapter 2 reviews relevant academic and industry literature on campus helpdesks and SLA automation. Chapter 3 establishes formal requirement specifications, user personas, and Agile SDLC methodologies. Chapter 4 details system architecture, 3NF database design, and algorithmic working principles. Chapter 5 presents empirical results, benchmark evaluations, and engineering bug resolutions. Finally, Chapter 6 concludes the report with key learnings and future artificial intelligence enhancements.</w:t>
       </w:r>
     </w:p>
     <w:p>
@@ -9244,15 +9525,7 @@
           <w:color w:val="000000"/>
           <w:sz w:val="24"/>
         </w:rPr>
-        <w:t xml:space="preserve">The management of organizational complaints has evolved through three distinct technological epochs. In the pre-digital era, institutions relied exclusively on manual registers, physical suggestion boxes, and hierarchical escalation through physical petitions. Studies by Bendel and Afifi (1977) on administrative workflow efficiency demonstrated that physical petition pipelines introduce systemic friction, with over 65% of customer dissatisfaction stemming directly from misrouted or unacknowledged documents </w:t>
-      </w:r>
-      <w:r>
-        <w:rPr>
-          <w:rFonts w:ascii="Arial" w:hAnsi="Arial"/>
-          <w:color w:val="000000"/>
-          <w:sz w:val="24"/>
-        </w:rPr>
-        <w:t>rather than the underlying grievance itself.</w:t>
+        <w:t>The management of organizational complaints has evolved through three distinct technological epochs. In the pre-digital era, institutions relied exclusively on manual registers, physical suggestion boxes, and hierarchical escalation through physical petitions. Studies by Bendel and Afifi (1977) on administrative workflow efficiency demonstrated that physical petition pipelines introduce systemic friction, with over 65% of customer dissatisfaction stemming directly from misrouted or unacknowledged documents rather than the underlying grievance itself.</w:t>
       </w:r>
     </w:p>
     <w:p>
@@ -9266,15 +9539,7 @@
           <w:color w:val="000000"/>
           <w:sz w:val="24"/>
         </w:rPr>
-        <w:t>The advent of the internet in the late 1990s stimulated the second era: digital communication via unstructured email and public web forums. While email eliminated physical transit delays, it introduced severe cognitive overload for administrators. Research by Fielding (2000) on network-based software architectures highlighted that unstructured messaging protocols lack state machines, transactional ACID guarantees, and auditable accountability. Emails are frequently buried under daily correspondence, leaving</w:t>
-      </w:r>
-      <w:r>
-        <w:rPr>
-          <w:rFonts w:ascii="Arial" w:hAnsi="Arial"/>
-          <w:color w:val="000000"/>
-          <w:sz w:val="24"/>
-        </w:rPr>
-        <w:t xml:space="preserve"> complainants without visibility into resolution workflows.</w:t>
+        <w:t>The advent of the internet in the late 1990s stimulated the second era: digital communication via unstructured email and public web forums. While email eliminated physical transit delays, it introduced severe cognitive overload for administrators. Research by Fielding (2000) on network-based software architectures highlighted that unstructured messaging protocols lack state machines, transactional ACID guarantees, and auditable accountability. Emails are frequently buried under daily correspondence, leaving complainants without visibility into resolution workflows.</w:t>
       </w:r>
     </w:p>
     <w:p>
@@ -9328,7 +9593,27 @@
           <w:color w:val="000000"/>
           <w:sz w:val="23"/>
         </w:rPr>
-        <w:t xml:space="preserve">1. osTicket: </w:t>
+        <w:t xml:space="preserve">1. </w:t>
+      </w:r>
+      <w:proofErr w:type="spellStart"/>
+      <w:r>
+        <w:rPr>
+          <w:rFonts w:ascii="Arial" w:hAnsi="Arial"/>
+          <w:b/>
+          <w:color w:val="000000"/>
+          <w:sz w:val="23"/>
+        </w:rPr>
+        <w:t>osTicket</w:t>
+      </w:r>
+      <w:proofErr w:type="spellEnd"/>
+      <w:r>
+        <w:rPr>
+          <w:rFonts w:ascii="Arial" w:hAnsi="Arial"/>
+          <w:b/>
+          <w:color w:val="000000"/>
+          <w:sz w:val="23"/>
+        </w:rPr>
+        <w:t xml:space="preserve">: </w:t>
       </w:r>
       <w:r>
         <w:rPr>
@@ -10074,15 +10359,7 @@
           <w:color w:val="000000"/>
           <w:sz w:val="24"/>
         </w:rPr>
-        <w:t xml:space="preserve">Existing literature and industrial implementations reveal three critical deficiencies: (1) the prevalence of bulky, resource-heavy backend frameworks that impede rapid cloud edge deployment, (2) the total lack of closed-loop verification where the complainant holds veto power over ticket resolution, and (3) severe client-side media bloat degrading relational database performance. The proposed system directly overcomes all three gaps through zero-framework Java SE 21 architecture, bidirectional satisfaction </w:t>
-      </w:r>
-      <w:r>
-        <w:rPr>
-          <w:rFonts w:ascii="Arial" w:hAnsi="Arial"/>
-          <w:color w:val="000000"/>
-          <w:sz w:val="24"/>
-        </w:rPr>
-        <w:t>locks, and client-side HTML5 canvas compression.</w:t>
+        <w:t>Existing literature and industrial implementations reveal three critical deficiencies: (1) the prevalence of bulky, resource-heavy backend frameworks that impede rapid cloud edge deployment, (2) the total lack of closed-loop verification where the complainant holds veto power over ticket resolution, and (3) severe client-side media bloat degrading relational database performance. The proposed system directly overcomes all three gaps through zero-framework Java SE 21 architecture, bidirectional satisfaction locks, and client-side HTML5 canvas compression.</w:t>
       </w:r>
     </w:p>
     <w:p>
@@ -10183,7 +10460,25 @@
           <w:color w:val="000000"/>
           <w:sz w:val="23"/>
         </w:rPr>
-        <w:t>The system must authenticate users via BCrypt hashed passwords and assign appropriate authorization tokens corresponding to roles (STUDENT, ADMIN, COORDINATOR, HOD, DEAN).</w:t>
+        <w:t xml:space="preserve">The system must authenticate users via </w:t>
+      </w:r>
+      <w:proofErr w:type="spellStart"/>
+      <w:r>
+        <w:rPr>
+          <w:rFonts w:ascii="Arial" w:hAnsi="Arial"/>
+          <w:color w:val="000000"/>
+          <w:sz w:val="23"/>
+        </w:rPr>
+        <w:t>BCrypt</w:t>
+      </w:r>
+      <w:proofErr w:type="spellEnd"/>
+      <w:r>
+        <w:rPr>
+          <w:rFonts w:ascii="Arial" w:hAnsi="Arial"/>
+          <w:color w:val="000000"/>
+          <w:sz w:val="23"/>
+        </w:rPr>
+        <w:t xml:space="preserve"> hashed passwords and assign appropriate authorization tokens corresponding to roles (STUDENT, ADMIN, COORDINATOR, HOD, DEAN).</w:t>
       </w:r>
     </w:p>
     <w:p>
@@ -10348,7 +10643,25 @@
           <w:color w:val="000000"/>
           <w:sz w:val="23"/>
         </w:rPr>
-        <w:t>The system must strictly prevent ticket resolution until the student inputs a 1-to-5 star rating and optional comments.</w:t>
+        <w:t>The system must strictly prevent ticket resolution until the student inputs a 1-to-</w:t>
+      </w:r>
+      <w:proofErr w:type="gramStart"/>
+      <w:r>
+        <w:rPr>
+          <w:rFonts w:ascii="Arial" w:hAnsi="Arial"/>
+          <w:color w:val="000000"/>
+          <w:sz w:val="23"/>
+        </w:rPr>
+        <w:t>5 star</w:t>
+      </w:r>
+      <w:proofErr w:type="gramEnd"/>
+      <w:r>
+        <w:rPr>
+          <w:rFonts w:ascii="Arial" w:hAnsi="Arial"/>
+          <w:color w:val="000000"/>
+          <w:sz w:val="23"/>
+        </w:rPr>
+        <w:t xml:space="preserve"> rating and optional comments.</w:t>
       </w:r>
     </w:p>
     <w:p>
@@ -10429,7 +10742,43 @@
           <w:color w:val="000000"/>
           <w:sz w:val="23"/>
         </w:rPr>
-        <w:t>All database queries must use PreparedStatement placeholders to prevent SQL injection. Passwords must be hashed with BCrypt (work factor 12).</w:t>
+        <w:t xml:space="preserve">All database queries must use </w:t>
+      </w:r>
+      <w:proofErr w:type="spellStart"/>
+      <w:r>
+        <w:rPr>
+          <w:rFonts w:ascii="Arial" w:hAnsi="Arial"/>
+          <w:color w:val="000000"/>
+          <w:sz w:val="23"/>
+        </w:rPr>
+        <w:t>PreparedStatement</w:t>
+      </w:r>
+      <w:proofErr w:type="spellEnd"/>
+      <w:r>
+        <w:rPr>
+          <w:rFonts w:ascii="Arial" w:hAnsi="Arial"/>
+          <w:color w:val="000000"/>
+          <w:sz w:val="23"/>
+        </w:rPr>
+        <w:t xml:space="preserve"> placeholders to prevent SQL injection. Passwords must be hashed with </w:t>
+      </w:r>
+      <w:proofErr w:type="spellStart"/>
+      <w:r>
+        <w:rPr>
+          <w:rFonts w:ascii="Arial" w:hAnsi="Arial"/>
+          <w:color w:val="000000"/>
+          <w:sz w:val="23"/>
+        </w:rPr>
+        <w:t>BCrypt</w:t>
+      </w:r>
+      <w:proofErr w:type="spellEnd"/>
+      <w:r>
+        <w:rPr>
+          <w:rFonts w:ascii="Arial" w:hAnsi="Arial"/>
+          <w:color w:val="000000"/>
+          <w:sz w:val="23"/>
+        </w:rPr>
+        <w:t xml:space="preserve"> (work factor 12).</w:t>
       </w:r>
     </w:p>
     <w:p>
@@ -10573,7 +10922,43 @@
           <w:color w:val="000000"/>
           <w:sz w:val="23"/>
         </w:rPr>
-        <w:t>Given a student is authenticated, When they upload a 6 MB JPEG photo with a complaint, Then the frontend downsamples it to max 1200px (&lt;150 KB) and saves it in MySQL LONGTEXT.</w:t>
+        <w:t xml:space="preserve">Given a student is authenticated, </w:t>
+      </w:r>
+      <w:proofErr w:type="gramStart"/>
+      <w:r>
+        <w:rPr>
+          <w:rFonts w:ascii="Arial" w:hAnsi="Arial"/>
+          <w:color w:val="000000"/>
+          <w:sz w:val="23"/>
+        </w:rPr>
+        <w:t>When</w:t>
+      </w:r>
+      <w:proofErr w:type="gramEnd"/>
+      <w:r>
+        <w:rPr>
+          <w:rFonts w:ascii="Arial" w:hAnsi="Arial"/>
+          <w:color w:val="000000"/>
+          <w:sz w:val="23"/>
+        </w:rPr>
+        <w:t xml:space="preserve"> they upload a 6 MB JPEG photo with a complaint, Then the frontend </w:t>
+      </w:r>
+      <w:proofErr w:type="spellStart"/>
+      <w:r>
+        <w:rPr>
+          <w:rFonts w:ascii="Arial" w:hAnsi="Arial"/>
+          <w:color w:val="000000"/>
+          <w:sz w:val="23"/>
+        </w:rPr>
+        <w:t>downsamples</w:t>
+      </w:r>
+      <w:proofErr w:type="spellEnd"/>
+      <w:r>
+        <w:rPr>
+          <w:rFonts w:ascii="Arial" w:hAnsi="Arial"/>
+          <w:color w:val="000000"/>
+          <w:sz w:val="23"/>
+        </w:rPr>
+        <w:t xml:space="preserve"> it to max 1200px (&lt;150 KB) and saves it in MySQL LONGTEXT.</w:t>
       </w:r>
     </w:p>
     <w:p>
@@ -10606,7 +10991,61 @@
           <w:color w:val="000000"/>
           <w:sz w:val="23"/>
         </w:rPr>
-        <w:t>Given a ticket in SUBMITTED state has an age exceeding 24 hours, When the escalation daemon runs, Then escalation_level is updated to HOD and an audit log is committed.</w:t>
+        <w:t xml:space="preserve">Given a ticket in SUBMITTED state </w:t>
+      </w:r>
+      <w:proofErr w:type="gramStart"/>
+      <w:r>
+        <w:rPr>
+          <w:rFonts w:ascii="Arial" w:hAnsi="Arial"/>
+          <w:color w:val="000000"/>
+          <w:sz w:val="23"/>
+        </w:rPr>
+        <w:t>has</w:t>
+      </w:r>
+      <w:proofErr w:type="gramEnd"/>
+      <w:r>
+        <w:rPr>
+          <w:rFonts w:ascii="Arial" w:hAnsi="Arial"/>
+          <w:color w:val="000000"/>
+          <w:sz w:val="23"/>
+        </w:rPr>
+        <w:t xml:space="preserve"> an age exceeding 24 hours, When the escalation daemon runs, </w:t>
+      </w:r>
+      <w:proofErr w:type="gramStart"/>
+      <w:r>
+        <w:rPr>
+          <w:rFonts w:ascii="Arial" w:hAnsi="Arial"/>
+          <w:color w:val="000000"/>
+          <w:sz w:val="23"/>
+        </w:rPr>
+        <w:t>Then</w:t>
+      </w:r>
+      <w:proofErr w:type="gramEnd"/>
+      <w:r>
+        <w:rPr>
+          <w:rFonts w:ascii="Arial" w:hAnsi="Arial"/>
+          <w:color w:val="000000"/>
+          <w:sz w:val="23"/>
+        </w:rPr>
+        <w:t xml:space="preserve"> </w:t>
+      </w:r>
+      <w:proofErr w:type="spellStart"/>
+      <w:r>
+        <w:rPr>
+          <w:rFonts w:ascii="Arial" w:hAnsi="Arial"/>
+          <w:color w:val="000000"/>
+          <w:sz w:val="23"/>
+        </w:rPr>
+        <w:t>escalation_level</w:t>
+      </w:r>
+      <w:proofErr w:type="spellEnd"/>
+      <w:r>
+        <w:rPr>
+          <w:rFonts w:ascii="Arial" w:hAnsi="Arial"/>
+          <w:color w:val="000000"/>
+          <w:sz w:val="23"/>
+        </w:rPr>
+        <w:t xml:space="preserve"> is updated to HOD and an audit log is committed.</w:t>
       </w:r>
     </w:p>
     <w:p>
@@ -10639,7 +11078,43 @@
           <w:color w:val="000000"/>
           <w:sz w:val="23"/>
         </w:rPr>
-        <w:t>Given an administrator invokes PUT /api/complaints/action to mark status RESOLVED directly, When the server executes the handler, Then it rejects the call with HTTP 400 Bad Request.</w:t>
+        <w:t>Given an administrator invokes PUT /</w:t>
+      </w:r>
+      <w:proofErr w:type="spellStart"/>
+      <w:r>
+        <w:rPr>
+          <w:rFonts w:ascii="Arial" w:hAnsi="Arial"/>
+          <w:color w:val="000000"/>
+          <w:sz w:val="23"/>
+        </w:rPr>
+        <w:t>api</w:t>
+      </w:r>
+      <w:proofErr w:type="spellEnd"/>
+      <w:r>
+        <w:rPr>
+          <w:rFonts w:ascii="Arial" w:hAnsi="Arial"/>
+          <w:color w:val="000000"/>
+          <w:sz w:val="23"/>
+        </w:rPr>
+        <w:t xml:space="preserve">/complaints/action to mark status RESOLVED directly, When the server executes the handler, </w:t>
+      </w:r>
+      <w:proofErr w:type="gramStart"/>
+      <w:r>
+        <w:rPr>
+          <w:rFonts w:ascii="Arial" w:hAnsi="Arial"/>
+          <w:color w:val="000000"/>
+          <w:sz w:val="23"/>
+        </w:rPr>
+        <w:t>Then</w:t>
+      </w:r>
+      <w:proofErr w:type="gramEnd"/>
+      <w:r>
+        <w:rPr>
+          <w:rFonts w:ascii="Arial" w:hAnsi="Arial"/>
+          <w:color w:val="000000"/>
+          <w:sz w:val="23"/>
+        </w:rPr>
+        <w:t xml:space="preserve"> it rejects the call with HTTP 400 Bad Request.</w:t>
       </w:r>
     </w:p>
     <w:p>
@@ -10668,15 +11143,25 @@
           <w:color w:val="000000"/>
           <w:sz w:val="24"/>
         </w:rPr>
-        <w:t>Project execution followed the disciplined 4-Phase Agile SDLC mandated by the SIST Capstone curriculum: Phase 1 (Define), Phase 2 (Design), Phase 3 (Develop), and Phase 4 (Deploy). All AI-assisted architectural modeling and query optimization adhered strictly to the CARE prompting formula: Context (Full-stack developer in Java 21 and MySQL 8.0) -&gt; Action (Design 3NF relational schemas and background daemons) -&gt; Result (Return production-ready zero-framework code) -&gt; Example (Provide sample complaint payload</w:t>
-      </w:r>
+        <w:t xml:space="preserve">Project execution followed the disciplined 4-Phase Agile SDLC mandated by the SIST Capstone curriculum: Phase 1 (Define), Phase 2 (Design), Phase 3 (Develop), and Phase 4 (Deploy). All AI-assisted architectural </w:t>
+      </w:r>
+      <w:proofErr w:type="spellStart"/>
       <w:r>
         <w:rPr>
           <w:rFonts w:ascii="Arial" w:hAnsi="Arial"/>
           <w:color w:val="000000"/>
           <w:sz w:val="24"/>
         </w:rPr>
-        <w:t>s and escalation timing logic).</w:t>
+        <w:t>modeling</w:t>
+      </w:r>
+      <w:proofErr w:type="spellEnd"/>
+      <w:r>
+        <w:rPr>
+          <w:rFonts w:ascii="Arial" w:hAnsi="Arial"/>
+          <w:color w:val="000000"/>
+          <w:sz w:val="24"/>
+        </w:rPr>
+        <w:t xml:space="preserve"> and query optimization adhered strictly to the CARE prompting formula: Context (Full-stack developer in Java 21 and MySQL 8.0) -&gt; Action (Design 3NF relational schemas and background daemons) -&gt; Result (Return production-ready zero-framework code) -&gt; Example (Provide sample complaint payloads and escalation timing logic).</w:t>
       </w:r>
     </w:p>
     <w:p>
@@ -10739,7 +11224,43 @@
           <w:color w:val="000000"/>
           <w:sz w:val="23"/>
         </w:rPr>
-        <w:t>Intel Core i5 / AMD Ryzen 5 or higher (6 cores, 2.5 GHz+), 16 GB DDR4 RAM, 512 GB NVMe SSD.</w:t>
+        <w:t xml:space="preserve">Intel Core i5 / AMD </w:t>
+      </w:r>
+      <w:proofErr w:type="spellStart"/>
+      <w:r>
+        <w:rPr>
+          <w:rFonts w:ascii="Arial" w:hAnsi="Arial"/>
+          <w:color w:val="000000"/>
+          <w:sz w:val="23"/>
+        </w:rPr>
+        <w:t>Ryzen</w:t>
+      </w:r>
+      <w:proofErr w:type="spellEnd"/>
+      <w:r>
+        <w:rPr>
+          <w:rFonts w:ascii="Arial" w:hAnsi="Arial"/>
+          <w:color w:val="000000"/>
+          <w:sz w:val="23"/>
+        </w:rPr>
+        <w:t xml:space="preserve"> 5 or higher (6 cores, 2.5 GHz+), 16 GB DDR4 RAM, 512 GB </w:t>
+      </w:r>
+      <w:proofErr w:type="spellStart"/>
+      <w:r>
+        <w:rPr>
+          <w:rFonts w:ascii="Arial" w:hAnsi="Arial"/>
+          <w:color w:val="000000"/>
+          <w:sz w:val="23"/>
+        </w:rPr>
+        <w:t>NVMe</w:t>
+      </w:r>
+      <w:proofErr w:type="spellEnd"/>
+      <w:r>
+        <w:rPr>
+          <w:rFonts w:ascii="Arial" w:hAnsi="Arial"/>
+          <w:color w:val="000000"/>
+          <w:sz w:val="23"/>
+        </w:rPr>
+        <w:t xml:space="preserve"> SSD.</w:t>
       </w:r>
     </w:p>
     <w:p>
@@ -10919,7 +11440,25 @@
           <w:color w:val="000000"/>
           <w:sz w:val="23"/>
         </w:rPr>
-        <w:t>MySQL Server 8.0 / MariaDB 10.4 (InnoDB Engine).</w:t>
+        <w:t>MySQL Server 8.0 / MariaDB 10.4 (</w:t>
+      </w:r>
+      <w:proofErr w:type="spellStart"/>
+      <w:r>
+        <w:rPr>
+          <w:rFonts w:ascii="Arial" w:hAnsi="Arial"/>
+          <w:color w:val="000000"/>
+          <w:sz w:val="23"/>
+        </w:rPr>
+        <w:t>InnoDB</w:t>
+      </w:r>
+      <w:proofErr w:type="spellEnd"/>
+      <w:r>
+        <w:rPr>
+          <w:rFonts w:ascii="Arial" w:hAnsi="Arial"/>
+          <w:color w:val="000000"/>
+          <w:sz w:val="23"/>
+        </w:rPr>
+        <w:t xml:space="preserve"> Engine).</w:t>
       </w:r>
     </w:p>
     <w:p>
@@ -10979,13 +11518,77 @@
         </w:rPr>
         <w:t xml:space="preserve">Core Java Libraries: </w:t>
       </w:r>
-      <w:r>
-        <w:rPr>
-          <w:rFonts w:ascii="Arial" w:hAnsi="Arial"/>
-          <w:color w:val="000000"/>
-          <w:sz w:val="23"/>
-        </w:rPr>
-        <w:t>com.google.code.gson:gson:2.10.1 (JSON), org.mindrot:jbcrypt:0.4 (Security), com.mysql:mysql-connector-j:9.4.0 (JDBC).</w:t>
+      <w:proofErr w:type="gramStart"/>
+      <w:r>
+        <w:rPr>
+          <w:rFonts w:ascii="Arial" w:hAnsi="Arial"/>
+          <w:color w:val="000000"/>
+          <w:sz w:val="23"/>
+        </w:rPr>
+        <w:t>com.google</w:t>
+      </w:r>
+      <w:proofErr w:type="gramEnd"/>
+      <w:r>
+        <w:rPr>
+          <w:rFonts w:ascii="Arial" w:hAnsi="Arial"/>
+          <w:color w:val="000000"/>
+          <w:sz w:val="23"/>
+        </w:rPr>
+        <w:t>.</w:t>
+      </w:r>
+      <w:proofErr w:type="gramStart"/>
+      <w:r>
+        <w:rPr>
+          <w:rFonts w:ascii="Arial" w:hAnsi="Arial"/>
+          <w:color w:val="000000"/>
+          <w:sz w:val="23"/>
+        </w:rPr>
+        <w:t>code.gson</w:t>
+      </w:r>
+      <w:proofErr w:type="gramEnd"/>
+      <w:r>
+        <w:rPr>
+          <w:rFonts w:ascii="Arial" w:hAnsi="Arial"/>
+          <w:color w:val="000000"/>
+          <w:sz w:val="23"/>
+        </w:rPr>
+        <w:t xml:space="preserve">:gson:2.10.1 (JSON), </w:t>
+      </w:r>
+      <w:proofErr w:type="gramStart"/>
+      <w:r>
+        <w:rPr>
+          <w:rFonts w:ascii="Arial" w:hAnsi="Arial"/>
+          <w:color w:val="000000"/>
+          <w:sz w:val="23"/>
+        </w:rPr>
+        <w:t>org.mindrot</w:t>
+      </w:r>
+      <w:proofErr w:type="gramEnd"/>
+      <w:r>
+        <w:rPr>
+          <w:rFonts w:ascii="Arial" w:hAnsi="Arial"/>
+          <w:color w:val="000000"/>
+          <w:sz w:val="23"/>
+        </w:rPr>
+        <w:t xml:space="preserve">:jbcrypt:0.4 (Security), </w:t>
+      </w:r>
+      <w:proofErr w:type="gramStart"/>
+      <w:r>
+        <w:rPr>
+          <w:rFonts w:ascii="Arial" w:hAnsi="Arial"/>
+          <w:color w:val="000000"/>
+          <w:sz w:val="23"/>
+        </w:rPr>
+        <w:t>com.mysql</w:t>
+      </w:r>
+      <w:proofErr w:type="gramEnd"/>
+      <w:r>
+        <w:rPr>
+          <w:rFonts w:ascii="Arial" w:hAnsi="Arial"/>
+          <w:color w:val="000000"/>
+          <w:sz w:val="23"/>
+        </w:rPr>
+        <w:t>:mysql-connector-j:9.4.0 (JDBC).</w:t>
       </w:r>
     </w:p>
     <w:p>
@@ -11166,7 +11769,53 @@
           <w:color w:val="000000"/>
           <w:sz w:val="23"/>
         </w:rPr>
-        <w:t>Built natively in pure Java SE 21 utilizing com.sun.net.httpserver.HttpServer. Operates a modular multi-threaded request pool on port 8080, routes REST requests through dedicated handler classes, enforces BCrypt security, and runs the background SLA daemon.</w:t>
+        <w:t xml:space="preserve">Built natively in pure Java SE 21 utilizing </w:t>
+      </w:r>
+      <w:proofErr w:type="spellStart"/>
+      <w:proofErr w:type="gramStart"/>
+      <w:r>
+        <w:rPr>
+          <w:rFonts w:ascii="Arial" w:hAnsi="Arial"/>
+          <w:color w:val="000000"/>
+          <w:sz w:val="23"/>
+        </w:rPr>
+        <w:t>com.sun.net.httpserver</w:t>
+      </w:r>
+      <w:proofErr w:type="gramEnd"/>
+      <w:r>
+        <w:rPr>
+          <w:rFonts w:ascii="Arial" w:hAnsi="Arial"/>
+          <w:color w:val="000000"/>
+          <w:sz w:val="23"/>
+        </w:rPr>
+        <w:t>.HttpServer</w:t>
+      </w:r>
+      <w:proofErr w:type="spellEnd"/>
+      <w:r>
+        <w:rPr>
+          <w:rFonts w:ascii="Arial" w:hAnsi="Arial"/>
+          <w:color w:val="000000"/>
+          <w:sz w:val="23"/>
+        </w:rPr>
+        <w:t xml:space="preserve">. Operates a modular multi-threaded request pool on port 8080, routes REST requests through dedicated handler classes, enforces </w:t>
+      </w:r>
+      <w:proofErr w:type="spellStart"/>
+      <w:r>
+        <w:rPr>
+          <w:rFonts w:ascii="Arial" w:hAnsi="Arial"/>
+          <w:color w:val="000000"/>
+          <w:sz w:val="23"/>
+        </w:rPr>
+        <w:t>BCrypt</w:t>
+      </w:r>
+      <w:proofErr w:type="spellEnd"/>
+      <w:r>
+        <w:rPr>
+          <w:rFonts w:ascii="Arial" w:hAnsi="Arial"/>
+          <w:color w:val="000000"/>
+          <w:sz w:val="23"/>
+        </w:rPr>
+        <w:t xml:space="preserve"> security, and runs the background SLA daemon.</w:t>
       </w:r>
     </w:p>
     <w:p>
@@ -11211,10 +11860,27 @@
         <w:rPr>
           <w:noProof/>
         </w:rPr>
+        <w:lastRenderedPageBreak/>
         <w:drawing>
-          <wp:inline distT="0" distB="0" distL="0" distR="0" wp14:anchorId="611644CB" wp14:editId="2E5A1084">
-            <wp:extent cx="5486400" cy="3546764"/>
-            <wp:effectExtent l="0" t="0" r="0" b="0"/>
+          <wp:anchor distT="0" distB="0" distL="114300" distR="114300" simplePos="0" relativeHeight="251662336" behindDoc="1" locked="0" layoutInCell="1" allowOverlap="1" wp14:anchorId="611644CB" wp14:editId="74464D73">
+            <wp:simplePos x="0" y="0"/>
+            <wp:positionH relativeFrom="column">
+              <wp:posOffset>120650</wp:posOffset>
+            </wp:positionH>
+            <wp:positionV relativeFrom="page">
+              <wp:posOffset>914400</wp:posOffset>
+            </wp:positionV>
+            <wp:extent cx="5485765" cy="4517390"/>
+            <wp:effectExtent l="0" t="0" r="635" b="0"/>
+            <wp:wrapTight wrapText="bothSides">
+              <wp:wrapPolygon edited="0">
+                <wp:start x="0" y="0"/>
+                <wp:lineTo x="0" y="21497"/>
+                <wp:lineTo x="21527" y="21497"/>
+                <wp:lineTo x="21527" y="0"/>
+                <wp:lineTo x="0" y="0"/>
+              </wp:wrapPolygon>
+            </wp:wrapTight>
             <wp:docPr id="8" name="Picture 8"/>
             <wp:cNvGraphicFramePr>
               <a:graphicFrameLocks xmlns:a="http://schemas.openxmlformats.org/drawingml/2006/main" noChangeAspect="1"/>
@@ -11227,7 +11893,1030 @@
                     <pic:cNvPicPr/>
                   </pic:nvPicPr>
                   <pic:blipFill>
-                    <a:blip r:embed="rId11"/>
+                    <a:blip r:embed="rId11" cstate="print">
+                      <a:extLst>
+                        <a:ext uri="{28A0092B-C50C-407E-A947-70E740481C1C}">
+                          <a14:useLocalDpi xmlns:a14="http://schemas.microsoft.com/office/drawing/2010/main" val="0"/>
+                        </a:ext>
+                      </a:extLst>
+                    </a:blip>
+                    <a:stretch>
+                      <a:fillRect/>
+                    </a:stretch>
+                  </pic:blipFill>
+                  <pic:spPr>
+                    <a:xfrm>
+                      <a:off x="0" y="0"/>
+                      <a:ext cx="5485765" cy="4517390"/>
+                    </a:xfrm>
+                    <a:prstGeom prst="rect">
+                      <a:avLst/>
+                    </a:prstGeom>
+                  </pic:spPr>
+                </pic:pic>
+              </a:graphicData>
+            </a:graphic>
+          </wp:anchor>
+        </w:drawing>
+      </w:r>
+    </w:p>
+    <w:p>
+      <w:pPr>
+        <w:spacing w:before="40" w:after="240"/>
+        <w:jc w:val="center"/>
+      </w:pPr>
+      <w:r>
+        <w:rPr>
+          <w:rFonts w:ascii="Arial" w:hAnsi="Arial"/>
+          <w:b/>
+          <w:i/>
+          <w:color w:val="334155"/>
+          <w:sz w:val="20"/>
+        </w:rPr>
+        <w:t>Figure 1.1: Three-Tier System Architecture Diagram (Presentation, Logic &amp; Persistence)</w:t>
+      </w:r>
+    </w:p>
+    <w:p>
+      <w:pPr>
+        <w:keepNext/>
+        <w:spacing w:before="200" w:after="60"/>
+      </w:pPr>
+      <w:r>
+        <w:rPr>
+          <w:rFonts w:ascii="Arial" w:hAnsi="Arial"/>
+          <w:b/>
+          <w:color w:val="1E293B"/>
+          <w:sz w:val="23"/>
+        </w:rPr>
+        <w:t>4.1.2 Various Stages of Execution (SDLC Phases 1 to 4)</w:t>
+      </w:r>
+    </w:p>
+    <w:p>
+      <w:pPr>
+        <w:spacing w:after="80" w:line="288" w:lineRule="auto"/>
+        <w:ind w:left="360"/>
+        <w:jc w:val="both"/>
+      </w:pPr>
+      <w:r>
+        <w:rPr>
+          <w:rFonts w:ascii="Arial" w:hAnsi="Arial"/>
+          <w:b/>
+          <w:color w:val="1D4ED8"/>
+          <w:sz w:val="23"/>
+        </w:rPr>
+        <w:t xml:space="preserve">•  </w:t>
+      </w:r>
+      <w:r>
+        <w:rPr>
+          <w:rFonts w:ascii="Arial" w:hAnsi="Arial"/>
+          <w:b/>
+          <w:color w:val="000000"/>
+          <w:sz w:val="23"/>
+        </w:rPr>
+        <w:t xml:space="preserve">Phase 1 (Define): </w:t>
+      </w:r>
+      <w:r>
+        <w:rPr>
+          <w:rFonts w:ascii="Arial" w:hAnsi="Arial"/>
+          <w:color w:val="000000"/>
+          <w:sz w:val="23"/>
+        </w:rPr>
+        <w:t>Conducted stakeholder interviews with campus hostel wardens and student representatives; formulated problem statements, user personas, and acceptance criteria.</w:t>
+      </w:r>
+    </w:p>
+    <w:p>
+      <w:pPr>
+        <w:spacing w:after="80" w:line="288" w:lineRule="auto"/>
+        <w:ind w:left="360"/>
+        <w:jc w:val="both"/>
+      </w:pPr>
+      <w:r>
+        <w:rPr>
+          <w:rFonts w:ascii="Arial" w:hAnsi="Arial"/>
+          <w:b/>
+          <w:color w:val="1D4ED8"/>
+          <w:sz w:val="23"/>
+        </w:rPr>
+        <w:t xml:space="preserve">•  </w:t>
+      </w:r>
+      <w:r>
+        <w:rPr>
+          <w:rFonts w:ascii="Arial" w:hAnsi="Arial"/>
+          <w:b/>
+          <w:color w:val="000000"/>
+          <w:sz w:val="23"/>
+        </w:rPr>
+        <w:t xml:space="preserve">Phase 2 (Design): </w:t>
+      </w:r>
+      <w:r>
+        <w:rPr>
+          <w:rFonts w:ascii="Arial" w:hAnsi="Arial"/>
+          <w:color w:val="000000"/>
+          <w:sz w:val="23"/>
+        </w:rPr>
+        <w:t>Engineered system architecture, drawn 3NF database schema diagrams on Draw.io, formulated REST API contracts, and drafted data dictionary.</w:t>
+      </w:r>
+    </w:p>
+    <w:p>
+      <w:pPr>
+        <w:spacing w:after="80" w:line="288" w:lineRule="auto"/>
+        <w:ind w:left="360"/>
+        <w:jc w:val="both"/>
+      </w:pPr>
+      <w:r>
+        <w:rPr>
+          <w:rFonts w:ascii="Arial" w:hAnsi="Arial"/>
+          <w:b/>
+          <w:color w:val="1D4ED8"/>
+          <w:sz w:val="23"/>
+        </w:rPr>
+        <w:t xml:space="preserve">•  </w:t>
+      </w:r>
+      <w:r>
+        <w:rPr>
+          <w:rFonts w:ascii="Arial" w:hAnsi="Arial"/>
+          <w:b/>
+          <w:color w:val="000000"/>
+          <w:sz w:val="23"/>
+        </w:rPr>
+        <w:t xml:space="preserve">Phase 3 (Develop): </w:t>
+      </w:r>
+      <w:r>
+        <w:rPr>
+          <w:rFonts w:ascii="Arial" w:hAnsi="Arial"/>
+          <w:color w:val="000000"/>
+          <w:sz w:val="23"/>
+        </w:rPr>
+        <w:t xml:space="preserve">Developed Java SE 21 </w:t>
+      </w:r>
+      <w:proofErr w:type="spellStart"/>
+      <w:r>
+        <w:rPr>
+          <w:rFonts w:ascii="Arial" w:hAnsi="Arial"/>
+          <w:color w:val="000000"/>
+          <w:sz w:val="23"/>
+        </w:rPr>
+        <w:t>HttpServer</w:t>
+      </w:r>
+      <w:proofErr w:type="spellEnd"/>
+      <w:r>
+        <w:rPr>
+          <w:rFonts w:ascii="Arial" w:hAnsi="Arial"/>
+          <w:color w:val="000000"/>
+          <w:sz w:val="23"/>
+        </w:rPr>
+        <w:t xml:space="preserve">, </w:t>
+      </w:r>
+      <w:proofErr w:type="spellStart"/>
+      <w:r>
+        <w:rPr>
+          <w:rFonts w:ascii="Arial" w:hAnsi="Arial"/>
+          <w:color w:val="000000"/>
+          <w:sz w:val="23"/>
+        </w:rPr>
+        <w:t>BCrypt</w:t>
+      </w:r>
+      <w:proofErr w:type="spellEnd"/>
+      <w:r>
+        <w:rPr>
+          <w:rFonts w:ascii="Arial" w:hAnsi="Arial"/>
+          <w:color w:val="000000"/>
+          <w:sz w:val="23"/>
+        </w:rPr>
+        <w:t xml:space="preserve"> password hashing, JDBC connection management, </w:t>
+      </w:r>
+      <w:proofErr w:type="spellStart"/>
+      <w:r>
+        <w:rPr>
+          <w:rFonts w:ascii="Arial" w:hAnsi="Arial"/>
+          <w:color w:val="000000"/>
+          <w:sz w:val="23"/>
+        </w:rPr>
+        <w:t>ScheduledExecutorService</w:t>
+      </w:r>
+      <w:proofErr w:type="spellEnd"/>
+      <w:r>
+        <w:rPr>
+          <w:rFonts w:ascii="Arial" w:hAnsi="Arial"/>
+          <w:color w:val="000000"/>
+          <w:sz w:val="23"/>
+        </w:rPr>
+        <w:t xml:space="preserve"> daemon, and Bootstrap 5 frontend.</w:t>
+      </w:r>
+    </w:p>
+    <w:p>
+      <w:pPr>
+        <w:spacing w:after="80" w:line="288" w:lineRule="auto"/>
+        <w:ind w:left="360"/>
+        <w:jc w:val="both"/>
+      </w:pPr>
+      <w:r>
+        <w:rPr>
+          <w:rFonts w:ascii="Arial" w:hAnsi="Arial"/>
+          <w:b/>
+          <w:color w:val="1D4ED8"/>
+          <w:sz w:val="23"/>
+        </w:rPr>
+        <w:t xml:space="preserve">•  </w:t>
+      </w:r>
+      <w:r>
+        <w:rPr>
+          <w:rFonts w:ascii="Arial" w:hAnsi="Arial"/>
+          <w:b/>
+          <w:color w:val="000000"/>
+          <w:sz w:val="23"/>
+        </w:rPr>
+        <w:t xml:space="preserve">Phase 4 (Deploy): </w:t>
+      </w:r>
+      <w:r>
+        <w:rPr>
+          <w:rFonts w:ascii="Arial" w:hAnsi="Arial"/>
+          <w:color w:val="000000"/>
+          <w:sz w:val="23"/>
+        </w:rPr>
+        <w:t>Conducted multi-client stress testing, solved base64 data truncation bugs, verified CORS compliance, and executed live end-to-end demonstrations.</w:t>
+      </w:r>
+    </w:p>
+    <w:p>
+      <w:pPr>
+        <w:spacing w:after="120" w:line="300" w:lineRule="auto"/>
+        <w:jc w:val="both"/>
+      </w:pPr>
+      <w:r>
+        <w:rPr>
+          <w:rFonts w:ascii="Arial" w:hAnsi="Arial"/>
+          <w:color w:val="000000"/>
+          <w:sz w:val="24"/>
+        </w:rPr>
+        <w:t>The Data Definition Language (DDL) specifications for the core relational tables are structured as follows:</w:t>
+      </w:r>
+    </w:p>
+    <w:tbl>
+      <w:tblPr>
+        <w:tblW w:w="0" w:type="auto"/>
+        <w:jc w:val="center"/>
+        <w:tblLook w:val="04A0" w:firstRow="1" w:lastRow="0" w:firstColumn="1" w:lastColumn="0" w:noHBand="0" w:noVBand="1"/>
+      </w:tblPr>
+      <w:tblGrid>
+        <w:gridCol w:w="9026"/>
+      </w:tblGrid>
+      <w:tr>
+        <w:trPr>
+          <w:jc w:val="center"/>
+        </w:trPr>
+        <w:tc>
+          <w:tcPr>
+            <w:tcW w:w="9026" w:type="dxa"/>
+            <w:shd w:val="clear" w:color="auto" w:fill="F1F5F9"/>
+            <w:tcMar>
+              <w:top w:w="100" w:type="dxa"/>
+              <w:left w:w="150" w:type="dxa"/>
+              <w:bottom w:w="100" w:type="dxa"/>
+              <w:right w:w="150" w:type="dxa"/>
+            </w:tcMar>
+          </w:tcPr>
+          <w:p>
+            <w:pPr>
+              <w:spacing w:after="0"/>
+            </w:pPr>
+            <w:r>
+              <w:rPr>
+                <w:rFonts w:ascii="Consolas" w:hAnsi="Consolas"/>
+                <w:color w:val="0F172A"/>
+                <w:sz w:val="19"/>
+              </w:rPr>
+              <w:lastRenderedPageBreak/>
+              <w:t>-- Table 1: users (User Authentication &amp; Roles)</w:t>
+            </w:r>
+            <w:r>
+              <w:rPr>
+                <w:rFonts w:ascii="Consolas" w:hAnsi="Consolas"/>
+                <w:color w:val="0F172A"/>
+                <w:sz w:val="19"/>
+              </w:rPr>
+              <w:br/>
+              <w:t>CREATE TABLE users (</w:t>
+            </w:r>
+            <w:r>
+              <w:rPr>
+                <w:rFonts w:ascii="Consolas" w:hAnsi="Consolas"/>
+                <w:color w:val="0F172A"/>
+                <w:sz w:val="19"/>
+              </w:rPr>
+              <w:br/>
+              <w:t xml:space="preserve">    id INT AUTO_INCREMENT PRIMARY KEY,</w:t>
+            </w:r>
+            <w:r>
+              <w:rPr>
+                <w:rFonts w:ascii="Consolas" w:hAnsi="Consolas"/>
+                <w:color w:val="0F172A"/>
+                <w:sz w:val="19"/>
+              </w:rPr>
+              <w:br/>
+              <w:t xml:space="preserve">    name VARCHAR(100) NOT NULL,</w:t>
+            </w:r>
+            <w:r>
+              <w:rPr>
+                <w:rFonts w:ascii="Consolas" w:hAnsi="Consolas"/>
+                <w:color w:val="0F172A"/>
+                <w:sz w:val="19"/>
+              </w:rPr>
+              <w:br/>
+              <w:t xml:space="preserve">    email VARCHAR(100) NOT NULL UNIQUE,</w:t>
+            </w:r>
+            <w:r>
+              <w:rPr>
+                <w:rFonts w:ascii="Consolas" w:hAnsi="Consolas"/>
+                <w:color w:val="0F172A"/>
+                <w:sz w:val="19"/>
+              </w:rPr>
+              <w:br/>
+              <w:t xml:space="preserve">    </w:t>
+            </w:r>
+            <w:proofErr w:type="spellStart"/>
+            <w:r>
+              <w:rPr>
+                <w:rFonts w:ascii="Consolas" w:hAnsi="Consolas"/>
+                <w:color w:val="0F172A"/>
+                <w:sz w:val="19"/>
+              </w:rPr>
+              <w:t>password_hash</w:t>
+            </w:r>
+            <w:proofErr w:type="spellEnd"/>
+            <w:r>
+              <w:rPr>
+                <w:rFonts w:ascii="Consolas" w:hAnsi="Consolas"/>
+                <w:color w:val="0F172A"/>
+                <w:sz w:val="19"/>
+              </w:rPr>
+              <w:t xml:space="preserve"> VARCHAR(255) NOT NULL,</w:t>
+            </w:r>
+            <w:r>
+              <w:rPr>
+                <w:rFonts w:ascii="Consolas" w:hAnsi="Consolas"/>
+                <w:color w:val="0F172A"/>
+                <w:sz w:val="19"/>
+              </w:rPr>
+              <w:br/>
+              <w:t xml:space="preserve">    role ENUM('STUDENT', 'ADMIN', 'COORDINATOR', 'HOD', 'DEAN') DEFAULT 'STUDENT',</w:t>
+            </w:r>
+            <w:r>
+              <w:rPr>
+                <w:rFonts w:ascii="Consolas" w:hAnsi="Consolas"/>
+                <w:color w:val="0F172A"/>
+                <w:sz w:val="19"/>
+              </w:rPr>
+              <w:br/>
+              <w:t xml:space="preserve">    department VARCHAR(100) DEFAULT 'CSE',</w:t>
+            </w:r>
+            <w:r>
+              <w:rPr>
+                <w:rFonts w:ascii="Consolas" w:hAnsi="Consolas"/>
+                <w:color w:val="0F172A"/>
+                <w:sz w:val="19"/>
+              </w:rPr>
+              <w:br/>
+              <w:t xml:space="preserve">    </w:t>
+            </w:r>
+            <w:proofErr w:type="spellStart"/>
+            <w:r>
+              <w:rPr>
+                <w:rFonts w:ascii="Consolas" w:hAnsi="Consolas"/>
+                <w:color w:val="0F172A"/>
+                <w:sz w:val="19"/>
+              </w:rPr>
+              <w:t>created_at</w:t>
+            </w:r>
+            <w:proofErr w:type="spellEnd"/>
+            <w:r>
+              <w:rPr>
+                <w:rFonts w:ascii="Consolas" w:hAnsi="Consolas"/>
+                <w:color w:val="0F172A"/>
+                <w:sz w:val="19"/>
+              </w:rPr>
+              <w:t xml:space="preserve"> TIMESTAMP DEFAULT CURRENT_TIMESTAMP</w:t>
+            </w:r>
+            <w:r>
+              <w:rPr>
+                <w:rFonts w:ascii="Consolas" w:hAnsi="Consolas"/>
+                <w:color w:val="0F172A"/>
+                <w:sz w:val="19"/>
+              </w:rPr>
+              <w:br/>
+              <w:t>);</w:t>
+            </w:r>
+            <w:r>
+              <w:rPr>
+                <w:rFonts w:ascii="Consolas" w:hAnsi="Consolas"/>
+                <w:color w:val="0F172A"/>
+                <w:sz w:val="19"/>
+              </w:rPr>
+              <w:br/>
+            </w:r>
+            <w:r>
+              <w:rPr>
+                <w:rFonts w:ascii="Consolas" w:hAnsi="Consolas"/>
+                <w:color w:val="0F172A"/>
+                <w:sz w:val="19"/>
+              </w:rPr>
+              <w:br/>
+              <w:t>-- Table 2: complaints (Grievance Records &amp; SLA Tracking)</w:t>
+            </w:r>
+            <w:r>
+              <w:rPr>
+                <w:rFonts w:ascii="Consolas" w:hAnsi="Consolas"/>
+                <w:color w:val="0F172A"/>
+                <w:sz w:val="19"/>
+              </w:rPr>
+              <w:br/>
+              <w:t>CREATE TABLE complaints (</w:t>
+            </w:r>
+            <w:r>
+              <w:rPr>
+                <w:rFonts w:ascii="Consolas" w:hAnsi="Consolas"/>
+                <w:color w:val="0F172A"/>
+                <w:sz w:val="19"/>
+              </w:rPr>
+              <w:br/>
+              <w:t xml:space="preserve">    id INT AUTO_INCREMENT PRIMARY KEY,</w:t>
+            </w:r>
+            <w:r>
+              <w:rPr>
+                <w:rFonts w:ascii="Consolas" w:hAnsi="Consolas"/>
+                <w:color w:val="0F172A"/>
+                <w:sz w:val="19"/>
+              </w:rPr>
+              <w:br/>
+              <w:t xml:space="preserve">    </w:t>
+            </w:r>
+            <w:proofErr w:type="spellStart"/>
+            <w:r>
+              <w:rPr>
+                <w:rFonts w:ascii="Consolas" w:hAnsi="Consolas"/>
+                <w:color w:val="0F172A"/>
+                <w:sz w:val="19"/>
+              </w:rPr>
+              <w:t>tracking_id</w:t>
+            </w:r>
+            <w:proofErr w:type="spellEnd"/>
+            <w:r>
+              <w:rPr>
+                <w:rFonts w:ascii="Consolas" w:hAnsi="Consolas"/>
+                <w:color w:val="0F172A"/>
+                <w:sz w:val="19"/>
+              </w:rPr>
+              <w:t xml:space="preserve"> VARCHAR(50) NOT NULL UNIQUE,</w:t>
+            </w:r>
+            <w:r>
+              <w:rPr>
+                <w:rFonts w:ascii="Consolas" w:hAnsi="Consolas"/>
+                <w:color w:val="0F172A"/>
+                <w:sz w:val="19"/>
+              </w:rPr>
+              <w:br/>
+              <w:t xml:space="preserve">    </w:t>
+            </w:r>
+            <w:proofErr w:type="spellStart"/>
+            <w:r>
+              <w:rPr>
+                <w:rFonts w:ascii="Consolas" w:hAnsi="Consolas"/>
+                <w:color w:val="0F172A"/>
+                <w:sz w:val="19"/>
+              </w:rPr>
+              <w:t>user_id</w:t>
+            </w:r>
+            <w:proofErr w:type="spellEnd"/>
+            <w:r>
+              <w:rPr>
+                <w:rFonts w:ascii="Consolas" w:hAnsi="Consolas"/>
+                <w:color w:val="0F172A"/>
+                <w:sz w:val="19"/>
+              </w:rPr>
+              <w:t xml:space="preserve"> INT NOT NULL,</w:t>
+            </w:r>
+            <w:r>
+              <w:rPr>
+                <w:rFonts w:ascii="Consolas" w:hAnsi="Consolas"/>
+                <w:color w:val="0F172A"/>
+                <w:sz w:val="19"/>
+              </w:rPr>
+              <w:br/>
+              <w:t xml:space="preserve">    title VARCHAR(200) NOT NULL,</w:t>
+            </w:r>
+            <w:r>
+              <w:rPr>
+                <w:rFonts w:ascii="Consolas" w:hAnsi="Consolas"/>
+                <w:color w:val="0F172A"/>
+                <w:sz w:val="19"/>
+              </w:rPr>
+              <w:br/>
+              <w:t xml:space="preserve">    description TEXT NOT NULL,</w:t>
+            </w:r>
+            <w:r>
+              <w:rPr>
+                <w:rFonts w:ascii="Consolas" w:hAnsi="Consolas"/>
+                <w:color w:val="0F172A"/>
+                <w:sz w:val="19"/>
+              </w:rPr>
+              <w:br/>
+              <w:t xml:space="preserve">    category ENUM('Hostel', 'Academic', 'Mess', 'Infrastructure', 'Ragging', 'Other') NOT NULL,</w:t>
+            </w:r>
+            <w:r>
+              <w:rPr>
+                <w:rFonts w:ascii="Consolas" w:hAnsi="Consolas"/>
+                <w:color w:val="0F172A"/>
+                <w:sz w:val="19"/>
+              </w:rPr>
+              <w:br/>
+              <w:t xml:space="preserve">    priority ENUM('LOW', 'MEDIUM', 'HIGH', 'EMERGENCY') DEFAULT 'MEDIUM',</w:t>
+            </w:r>
+            <w:r>
+              <w:rPr>
+                <w:rFonts w:ascii="Consolas" w:hAnsi="Consolas"/>
+                <w:color w:val="0F172A"/>
+                <w:sz w:val="19"/>
+              </w:rPr>
+              <w:br/>
+              <w:t xml:space="preserve">    status ENUM('SUBMITTED', 'IN_PROGRESS', 'ACTION_TAKEN', 'RESOLVED') DEFAULT 'SUBMITTED',</w:t>
+            </w:r>
+            <w:r>
+              <w:rPr>
+                <w:rFonts w:ascii="Consolas" w:hAnsi="Consolas"/>
+                <w:color w:val="0F172A"/>
+                <w:sz w:val="19"/>
+              </w:rPr>
+              <w:br/>
+              <w:t xml:space="preserve">    </w:t>
+            </w:r>
+            <w:proofErr w:type="spellStart"/>
+            <w:r>
+              <w:rPr>
+                <w:rFonts w:ascii="Consolas" w:hAnsi="Consolas"/>
+                <w:color w:val="0F172A"/>
+                <w:sz w:val="19"/>
+              </w:rPr>
+              <w:t>escalation_level</w:t>
+            </w:r>
+            <w:proofErr w:type="spellEnd"/>
+            <w:r>
+              <w:rPr>
+                <w:rFonts w:ascii="Consolas" w:hAnsi="Consolas"/>
+                <w:color w:val="0F172A"/>
+                <w:sz w:val="19"/>
+              </w:rPr>
+              <w:t xml:space="preserve"> ENUM('COORDINATOR', 'HOD', 'DEAN') DEFAULT 'COORDINATOR',</w:t>
+            </w:r>
+            <w:r>
+              <w:rPr>
+                <w:rFonts w:ascii="Consolas" w:hAnsi="Consolas"/>
+                <w:color w:val="0F172A"/>
+                <w:sz w:val="19"/>
+              </w:rPr>
+              <w:br/>
+              <w:t xml:space="preserve">    </w:t>
+            </w:r>
+            <w:proofErr w:type="spellStart"/>
+            <w:r>
+              <w:rPr>
+                <w:rFonts w:ascii="Consolas" w:hAnsi="Consolas"/>
+                <w:color w:val="0F172A"/>
+                <w:sz w:val="19"/>
+              </w:rPr>
+              <w:t>attachment_path</w:t>
+            </w:r>
+            <w:proofErr w:type="spellEnd"/>
+            <w:r>
+              <w:rPr>
+                <w:rFonts w:ascii="Consolas" w:hAnsi="Consolas"/>
+                <w:color w:val="0F172A"/>
+                <w:sz w:val="19"/>
+              </w:rPr>
+              <w:t xml:space="preserve"> LONGTEXT,</w:t>
+            </w:r>
+            <w:r>
+              <w:rPr>
+                <w:rFonts w:ascii="Consolas" w:hAnsi="Consolas"/>
+                <w:color w:val="0F172A"/>
+                <w:sz w:val="19"/>
+              </w:rPr>
+              <w:br/>
+              <w:t xml:space="preserve">    rating TINYINT DEFAULT NULL,</w:t>
+            </w:r>
+            <w:r>
+              <w:rPr>
+                <w:rFonts w:ascii="Consolas" w:hAnsi="Consolas"/>
+                <w:color w:val="0F172A"/>
+                <w:sz w:val="19"/>
+              </w:rPr>
+              <w:br/>
+              <w:t xml:space="preserve">    feedback TEXT DEFAULT NULL,</w:t>
+            </w:r>
+            <w:r>
+              <w:rPr>
+                <w:rFonts w:ascii="Consolas" w:hAnsi="Consolas"/>
+                <w:color w:val="0F172A"/>
+                <w:sz w:val="19"/>
+              </w:rPr>
+              <w:br/>
+              <w:t xml:space="preserve">    </w:t>
+            </w:r>
+            <w:proofErr w:type="spellStart"/>
+            <w:r>
+              <w:rPr>
+                <w:rFonts w:ascii="Consolas" w:hAnsi="Consolas"/>
+                <w:color w:val="0F172A"/>
+                <w:sz w:val="19"/>
+              </w:rPr>
+              <w:t>created_at</w:t>
+            </w:r>
+            <w:proofErr w:type="spellEnd"/>
+            <w:r>
+              <w:rPr>
+                <w:rFonts w:ascii="Consolas" w:hAnsi="Consolas"/>
+                <w:color w:val="0F172A"/>
+                <w:sz w:val="19"/>
+              </w:rPr>
+              <w:t xml:space="preserve"> TIMESTAMP DEFAULT CURRENT_TIMESTAMP,</w:t>
+            </w:r>
+            <w:r>
+              <w:rPr>
+                <w:rFonts w:ascii="Consolas" w:hAnsi="Consolas"/>
+                <w:color w:val="0F172A"/>
+                <w:sz w:val="19"/>
+              </w:rPr>
+              <w:br/>
+              <w:t xml:space="preserve">    </w:t>
+            </w:r>
+            <w:proofErr w:type="spellStart"/>
+            <w:r>
+              <w:rPr>
+                <w:rFonts w:ascii="Consolas" w:hAnsi="Consolas"/>
+                <w:color w:val="0F172A"/>
+                <w:sz w:val="19"/>
+              </w:rPr>
+              <w:t>updated_at</w:t>
+            </w:r>
+            <w:proofErr w:type="spellEnd"/>
+            <w:r>
+              <w:rPr>
+                <w:rFonts w:ascii="Consolas" w:hAnsi="Consolas"/>
+                <w:color w:val="0F172A"/>
+                <w:sz w:val="19"/>
+              </w:rPr>
+              <w:t xml:space="preserve"> TIMESTAMP DEFAULT CURRENT_TIMESTAMP ON UPDATE CURRENT_TIMESTAMP,</w:t>
+            </w:r>
+            <w:r>
+              <w:rPr>
+                <w:rFonts w:ascii="Consolas" w:hAnsi="Consolas"/>
+                <w:color w:val="0F172A"/>
+                <w:sz w:val="19"/>
+              </w:rPr>
+              <w:br/>
+              <w:t xml:space="preserve">    FOREIGN KEY (</w:t>
+            </w:r>
+            <w:proofErr w:type="spellStart"/>
+            <w:r>
+              <w:rPr>
+                <w:rFonts w:ascii="Consolas" w:hAnsi="Consolas"/>
+                <w:color w:val="0F172A"/>
+                <w:sz w:val="19"/>
+              </w:rPr>
+              <w:t>user_id</w:t>
+            </w:r>
+            <w:proofErr w:type="spellEnd"/>
+            <w:r>
+              <w:rPr>
+                <w:rFonts w:ascii="Consolas" w:hAnsi="Consolas"/>
+                <w:color w:val="0F172A"/>
+                <w:sz w:val="19"/>
+              </w:rPr>
+              <w:t>) REFERENCES users(id) ON DELETE CASCADE</w:t>
+            </w:r>
+            <w:r>
+              <w:rPr>
+                <w:rFonts w:ascii="Consolas" w:hAnsi="Consolas"/>
+                <w:color w:val="0F172A"/>
+                <w:sz w:val="19"/>
+              </w:rPr>
+              <w:br/>
+              <w:t>);</w:t>
+            </w:r>
+            <w:r>
+              <w:rPr>
+                <w:rFonts w:ascii="Consolas" w:hAnsi="Consolas"/>
+                <w:color w:val="0F172A"/>
+                <w:sz w:val="19"/>
+              </w:rPr>
+              <w:br/>
+            </w:r>
+            <w:r>
+              <w:rPr>
+                <w:rFonts w:ascii="Consolas" w:hAnsi="Consolas"/>
+                <w:color w:val="0F172A"/>
+                <w:sz w:val="19"/>
+              </w:rPr>
+              <w:br/>
+              <w:t xml:space="preserve">-- Table 3: </w:t>
+            </w:r>
+            <w:proofErr w:type="spellStart"/>
+            <w:r>
+              <w:rPr>
+                <w:rFonts w:ascii="Consolas" w:hAnsi="Consolas"/>
+                <w:color w:val="0F172A"/>
+                <w:sz w:val="19"/>
+              </w:rPr>
+              <w:t>complaint_actions</w:t>
+            </w:r>
+            <w:proofErr w:type="spellEnd"/>
+            <w:r>
+              <w:rPr>
+                <w:rFonts w:ascii="Consolas" w:hAnsi="Consolas"/>
+                <w:color w:val="0F172A"/>
+                <w:sz w:val="19"/>
+              </w:rPr>
+              <w:t xml:space="preserve"> (Audit Trail &amp; Activity Log)</w:t>
+            </w:r>
+            <w:r>
+              <w:rPr>
+                <w:rFonts w:ascii="Consolas" w:hAnsi="Consolas"/>
+                <w:color w:val="0F172A"/>
+                <w:sz w:val="19"/>
+              </w:rPr>
+              <w:br/>
+              <w:t xml:space="preserve">CREATE TABLE </w:t>
+            </w:r>
+            <w:proofErr w:type="spellStart"/>
+            <w:r>
+              <w:rPr>
+                <w:rFonts w:ascii="Consolas" w:hAnsi="Consolas"/>
+                <w:color w:val="0F172A"/>
+                <w:sz w:val="19"/>
+              </w:rPr>
+              <w:t>complaint_actions</w:t>
+            </w:r>
+            <w:proofErr w:type="spellEnd"/>
+            <w:r>
+              <w:rPr>
+                <w:rFonts w:ascii="Consolas" w:hAnsi="Consolas"/>
+                <w:color w:val="0F172A"/>
+                <w:sz w:val="19"/>
+              </w:rPr>
+              <w:t xml:space="preserve"> (</w:t>
+            </w:r>
+            <w:r>
+              <w:rPr>
+                <w:rFonts w:ascii="Consolas" w:hAnsi="Consolas"/>
+                <w:color w:val="0F172A"/>
+                <w:sz w:val="19"/>
+              </w:rPr>
+              <w:br/>
+              <w:t xml:space="preserve">    id INT AUTO_INCREMENT PRIMARY KEY,</w:t>
+            </w:r>
+            <w:r>
+              <w:rPr>
+                <w:rFonts w:ascii="Consolas" w:hAnsi="Consolas"/>
+                <w:color w:val="0F172A"/>
+                <w:sz w:val="19"/>
+              </w:rPr>
+              <w:br/>
+              <w:t xml:space="preserve">    </w:t>
+            </w:r>
+            <w:proofErr w:type="spellStart"/>
+            <w:r>
+              <w:rPr>
+                <w:rFonts w:ascii="Consolas" w:hAnsi="Consolas"/>
+                <w:color w:val="0F172A"/>
+                <w:sz w:val="19"/>
+              </w:rPr>
+              <w:t>complaint_id</w:t>
+            </w:r>
+            <w:proofErr w:type="spellEnd"/>
+            <w:r>
+              <w:rPr>
+                <w:rFonts w:ascii="Consolas" w:hAnsi="Consolas"/>
+                <w:color w:val="0F172A"/>
+                <w:sz w:val="19"/>
+              </w:rPr>
+              <w:t xml:space="preserve"> INT NOT NULL,</w:t>
+            </w:r>
+            <w:r>
+              <w:rPr>
+                <w:rFonts w:ascii="Consolas" w:hAnsi="Consolas"/>
+                <w:color w:val="0F172A"/>
+                <w:sz w:val="19"/>
+              </w:rPr>
+              <w:br/>
+              <w:t xml:space="preserve">    </w:t>
+            </w:r>
+            <w:proofErr w:type="spellStart"/>
+            <w:r>
+              <w:rPr>
+                <w:rFonts w:ascii="Consolas" w:hAnsi="Consolas"/>
+                <w:color w:val="0F172A"/>
+                <w:sz w:val="19"/>
+              </w:rPr>
+              <w:t>action_by</w:t>
+            </w:r>
+            <w:proofErr w:type="spellEnd"/>
+            <w:r>
+              <w:rPr>
+                <w:rFonts w:ascii="Consolas" w:hAnsi="Consolas"/>
+                <w:color w:val="0F172A"/>
+                <w:sz w:val="19"/>
+              </w:rPr>
+              <w:t xml:space="preserve"> INT NOT NULL,</w:t>
+            </w:r>
+            <w:r>
+              <w:rPr>
+                <w:rFonts w:ascii="Consolas" w:hAnsi="Consolas"/>
+                <w:color w:val="0F172A"/>
+                <w:sz w:val="19"/>
+              </w:rPr>
+              <w:br/>
+              <w:t xml:space="preserve">    </w:t>
+            </w:r>
+            <w:proofErr w:type="spellStart"/>
+            <w:r>
+              <w:rPr>
+                <w:rFonts w:ascii="Consolas" w:hAnsi="Consolas"/>
+                <w:color w:val="0F172A"/>
+                <w:sz w:val="19"/>
+              </w:rPr>
+              <w:t>action_type</w:t>
+            </w:r>
+            <w:proofErr w:type="spellEnd"/>
+            <w:r>
+              <w:rPr>
+                <w:rFonts w:ascii="Consolas" w:hAnsi="Consolas"/>
+                <w:color w:val="0F172A"/>
+                <w:sz w:val="19"/>
+              </w:rPr>
+              <w:t xml:space="preserve"> VARCHAR(50) NOT NULL,</w:t>
+            </w:r>
+            <w:r>
+              <w:rPr>
+                <w:rFonts w:ascii="Consolas" w:hAnsi="Consolas"/>
+                <w:color w:val="0F172A"/>
+                <w:sz w:val="19"/>
+              </w:rPr>
+              <w:br/>
+              <w:t xml:space="preserve">    comments TEXT,</w:t>
+            </w:r>
+            <w:r>
+              <w:rPr>
+                <w:rFonts w:ascii="Consolas" w:hAnsi="Consolas"/>
+                <w:color w:val="0F172A"/>
+                <w:sz w:val="19"/>
+              </w:rPr>
+              <w:br/>
+              <w:t xml:space="preserve">    </w:t>
+            </w:r>
+            <w:proofErr w:type="spellStart"/>
+            <w:r>
+              <w:rPr>
+                <w:rFonts w:ascii="Consolas" w:hAnsi="Consolas"/>
+                <w:color w:val="0F172A"/>
+                <w:sz w:val="19"/>
+              </w:rPr>
+              <w:t>action_timestamp</w:t>
+            </w:r>
+            <w:proofErr w:type="spellEnd"/>
+            <w:r>
+              <w:rPr>
+                <w:rFonts w:ascii="Consolas" w:hAnsi="Consolas"/>
+                <w:color w:val="0F172A"/>
+                <w:sz w:val="19"/>
+              </w:rPr>
+              <w:t xml:space="preserve"> TIMESTAMP DEFAULT CURRENT_TIMESTAMP,</w:t>
+            </w:r>
+            <w:r>
+              <w:rPr>
+                <w:rFonts w:ascii="Consolas" w:hAnsi="Consolas"/>
+                <w:color w:val="0F172A"/>
+                <w:sz w:val="19"/>
+              </w:rPr>
+              <w:br/>
+              <w:t xml:space="preserve">    FOREIGN KEY (</w:t>
+            </w:r>
+            <w:proofErr w:type="spellStart"/>
+            <w:r>
+              <w:rPr>
+                <w:rFonts w:ascii="Consolas" w:hAnsi="Consolas"/>
+                <w:color w:val="0F172A"/>
+                <w:sz w:val="19"/>
+              </w:rPr>
+              <w:t>complaint_id</w:t>
+            </w:r>
+            <w:proofErr w:type="spellEnd"/>
+            <w:r>
+              <w:rPr>
+                <w:rFonts w:ascii="Consolas" w:hAnsi="Consolas"/>
+                <w:color w:val="0F172A"/>
+                <w:sz w:val="19"/>
+              </w:rPr>
+              <w:t>) REFERENCES complaints(id) ON DELETE CASCADE,</w:t>
+            </w:r>
+            <w:r>
+              <w:rPr>
+                <w:rFonts w:ascii="Consolas" w:hAnsi="Consolas"/>
+                <w:color w:val="0F172A"/>
+                <w:sz w:val="19"/>
+              </w:rPr>
+              <w:br/>
+              <w:t xml:space="preserve">    FOREIGN KEY (</w:t>
+            </w:r>
+            <w:proofErr w:type="spellStart"/>
+            <w:r>
+              <w:rPr>
+                <w:rFonts w:ascii="Consolas" w:hAnsi="Consolas"/>
+                <w:color w:val="0F172A"/>
+                <w:sz w:val="19"/>
+              </w:rPr>
+              <w:t>action_by</w:t>
+            </w:r>
+            <w:proofErr w:type="spellEnd"/>
+            <w:r>
+              <w:rPr>
+                <w:rFonts w:ascii="Consolas" w:hAnsi="Consolas"/>
+                <w:color w:val="0F172A"/>
+                <w:sz w:val="19"/>
+              </w:rPr>
+              <w:t>) REFERENCES users(id) ON DELETE CASCADE</w:t>
+            </w:r>
+            <w:r>
+              <w:rPr>
+                <w:rFonts w:ascii="Consolas" w:hAnsi="Consolas"/>
+                <w:color w:val="0F172A"/>
+                <w:sz w:val="19"/>
+              </w:rPr>
+              <w:br/>
+              <w:t>);</w:t>
+            </w:r>
+          </w:p>
+        </w:tc>
+      </w:tr>
+    </w:tbl>
+    <w:p>
+      <w:pPr>
+        <w:spacing w:after="120"/>
+      </w:pPr>
+    </w:p>
+    <w:p>
+      <w:pPr>
+        <w:keepNext/>
+        <w:spacing w:before="200" w:after="60"/>
+      </w:pPr>
+      <w:r>
+        <w:rPr>
+          <w:rFonts w:ascii="Arial" w:hAnsi="Arial"/>
+          <w:b/>
+          <w:color w:val="1E293B"/>
+          <w:sz w:val="23"/>
+        </w:rPr>
+        <w:t>4.1.4 Working Principles</w:t>
+      </w:r>
+    </w:p>
+    <w:p>
+      <w:pPr>
+        <w:spacing w:after="120" w:line="300" w:lineRule="auto"/>
+        <w:jc w:val="both"/>
+      </w:pPr>
+      <w:r>
+        <w:rPr>
+          <w:rFonts w:ascii="Arial" w:hAnsi="Arial"/>
+          <w:color w:val="000000"/>
+          <w:sz w:val="24"/>
+        </w:rPr>
+        <w:t>Figure 2.1 traces the complete state lifecycle and algorithmic decision branches executed during grievance processing:</w:t>
+      </w:r>
+    </w:p>
+    <w:p>
+      <w:pPr>
+        <w:spacing w:before="200" w:after="80"/>
+        <w:jc w:val="center"/>
+      </w:pPr>
+      <w:r>
+        <w:rPr>
+          <w:noProof/>
+        </w:rPr>
+        <w:lastRenderedPageBreak/>
+        <w:drawing>
+          <wp:inline distT="0" distB="0" distL="0" distR="0" wp14:anchorId="38C62994" wp14:editId="2535DB13">
+            <wp:extent cx="5486400" cy="3546764"/>
+            <wp:effectExtent l="0" t="0" r="0" b="0"/>
+            <wp:docPr id="10" name="Picture 10"/>
+            <wp:cNvGraphicFramePr>
+              <a:graphicFrameLocks xmlns:a="http://schemas.openxmlformats.org/drawingml/2006/main" noChangeAspect="1"/>
+            </wp:cNvGraphicFramePr>
+            <a:graphic xmlns:a="http://schemas.openxmlformats.org/drawingml/2006/main">
+              <a:graphicData uri="http://schemas.openxmlformats.org/drawingml/2006/picture">
+                <pic:pic xmlns:pic="http://schemas.openxmlformats.org/drawingml/2006/picture">
+                  <pic:nvPicPr>
+                    <pic:cNvPr id="0" name="fig2_workflow.png"/>
+                    <pic:cNvPicPr/>
+                  </pic:nvPicPr>
+                  <pic:blipFill>
+                    <a:blip r:embed="rId12"/>
                     <a:stretch>
                       <a:fillRect/>
                     </a:stretch>
@@ -11261,23 +12950,7 @@
           <w:color w:val="334155"/>
           <w:sz w:val="20"/>
         </w:rPr>
-        <w:t>Figure 1.1: Three-Tier System Architecture Diagram (Presentation, Logic &amp; Persistence)</w:t>
-      </w:r>
-    </w:p>
-    <w:p>
-      <w:pPr>
-        <w:keepNext/>
-        <w:spacing w:before="200" w:after="60"/>
-      </w:pPr>
-      <w:r>
-        <w:rPr>
-          <w:rFonts w:ascii="Arial" w:hAnsi="Arial"/>
-          <w:b/>
-          <w:color w:val="1E293B"/>
-          <w:sz w:val="23"/>
-        </w:rPr>
-        <w:lastRenderedPageBreak/>
-        <w:t>4.1.2 Various Stages of Execution (SDLC Phases 1 to 4)</w:t>
+        <w:t>Figure 2.1: Grievance Lifecycle &amp; Multi-Tier SLA Escalation State Flowchart</w:t>
       </w:r>
     </w:p>
     <w:p>
@@ -11302,15 +12975,105 @@
           <w:color w:val="000000"/>
           <w:sz w:val="23"/>
         </w:rPr>
-        <w:t xml:space="preserve">Phase 1 (Define): </w:t>
-      </w:r>
-      <w:r>
-        <w:rPr>
-          <w:rFonts w:ascii="Arial" w:hAnsi="Arial"/>
-          <w:color w:val="000000"/>
-          <w:sz w:val="23"/>
-        </w:rPr>
-        <w:t>Conducted stakeholder interviews with campus hostel wardens and student representatives; formulated problem statements, user personas, and acceptance criteria.</w:t>
+        <w:t xml:space="preserve">1. SLA Escalation Engine: </w:t>
+      </w:r>
+      <w:r>
+        <w:rPr>
+          <w:rFonts w:ascii="Arial" w:hAnsi="Arial"/>
+          <w:color w:val="000000"/>
+          <w:sz w:val="23"/>
+        </w:rPr>
+        <w:t xml:space="preserve">Upon ticket submission, a Java </w:t>
+      </w:r>
+      <w:proofErr w:type="spellStart"/>
+      <w:r>
+        <w:rPr>
+          <w:rFonts w:ascii="Arial" w:hAnsi="Arial"/>
+          <w:color w:val="000000"/>
+          <w:sz w:val="23"/>
+        </w:rPr>
+        <w:t>ScheduledExecutorService</w:t>
+      </w:r>
+      <w:proofErr w:type="spellEnd"/>
+      <w:r>
+        <w:rPr>
+          <w:rFonts w:ascii="Arial" w:hAnsi="Arial"/>
+          <w:color w:val="000000"/>
+          <w:sz w:val="23"/>
+        </w:rPr>
+        <w:t xml:space="preserve"> daemon awakens hourly to calculate elapsed time via </w:t>
+      </w:r>
+      <w:proofErr w:type="gramStart"/>
+      <w:r>
+        <w:rPr>
+          <w:rFonts w:ascii="Arial" w:hAnsi="Arial"/>
+          <w:color w:val="000000"/>
+          <w:sz w:val="23"/>
+        </w:rPr>
+        <w:t>TIMESTAMPDIFF(</w:t>
+      </w:r>
+      <w:proofErr w:type="gramEnd"/>
+      <w:r>
+        <w:rPr>
+          <w:rFonts w:ascii="Arial" w:hAnsi="Arial"/>
+          <w:color w:val="000000"/>
+          <w:sz w:val="23"/>
+        </w:rPr>
+        <w:t xml:space="preserve">HOUR, </w:t>
+      </w:r>
+      <w:proofErr w:type="spellStart"/>
+      <w:r>
+        <w:rPr>
+          <w:rFonts w:ascii="Arial" w:hAnsi="Arial"/>
+          <w:color w:val="000000"/>
+          <w:sz w:val="23"/>
+        </w:rPr>
+        <w:t>created_at</w:t>
+      </w:r>
+      <w:proofErr w:type="spellEnd"/>
+      <w:r>
+        <w:rPr>
+          <w:rFonts w:ascii="Arial" w:hAnsi="Arial"/>
+          <w:color w:val="000000"/>
+          <w:sz w:val="23"/>
+        </w:rPr>
+        <w:t xml:space="preserve">, </w:t>
+      </w:r>
+      <w:proofErr w:type="gramStart"/>
+      <w:r>
+        <w:rPr>
+          <w:rFonts w:ascii="Arial" w:hAnsi="Arial"/>
+          <w:color w:val="000000"/>
+          <w:sz w:val="23"/>
+        </w:rPr>
+        <w:t>NOW(</w:t>
+      </w:r>
+      <w:proofErr w:type="gramEnd"/>
+      <w:r>
+        <w:rPr>
+          <w:rFonts w:ascii="Arial" w:hAnsi="Arial"/>
+          <w:color w:val="000000"/>
+          <w:sz w:val="23"/>
+        </w:rPr>
+        <w:t xml:space="preserve">)). If the ticket remains in SUBMITTED state past 24 hours, </w:t>
+      </w:r>
+      <w:proofErr w:type="spellStart"/>
+      <w:r>
+        <w:rPr>
+          <w:rFonts w:ascii="Arial" w:hAnsi="Arial"/>
+          <w:color w:val="000000"/>
+          <w:sz w:val="23"/>
+        </w:rPr>
+        <w:t>escalation_level</w:t>
+      </w:r>
+      <w:proofErr w:type="spellEnd"/>
+      <w:r>
+        <w:rPr>
+          <w:rFonts w:ascii="Arial" w:hAnsi="Arial"/>
+          <w:color w:val="000000"/>
+          <w:sz w:val="23"/>
+        </w:rPr>
+        <w:t xml:space="preserve"> auto-promotes to HOD. Past 48 hours, it auto-promotes to DEAN.</w:t>
       </w:r>
     </w:p>
     <w:p>
@@ -11335,15 +13098,33 @@
           <w:color w:val="000000"/>
           <w:sz w:val="23"/>
         </w:rPr>
-        <w:t xml:space="preserve">Phase 2 (Design): </w:t>
-      </w:r>
-      <w:r>
-        <w:rPr>
-          <w:rFonts w:ascii="Arial" w:hAnsi="Arial"/>
-          <w:color w:val="000000"/>
-          <w:sz w:val="23"/>
-        </w:rPr>
-        <w:t>Engineered system architecture, drawn 3NF database schema diagrams on Draw.io, formulated REST API contracts, and drafted data dictionary.</w:t>
+        <w:t xml:space="preserve">2. Closed-Loop Rating Lock: </w:t>
+      </w:r>
+      <w:r>
+        <w:rPr>
+          <w:rFonts w:ascii="Arial" w:hAnsi="Arial"/>
+          <w:color w:val="000000"/>
+          <w:sz w:val="23"/>
+        </w:rPr>
+        <w:t>When a coordinator executes a repair, they transition the ticket to ACTION_TAKEN. The backend strictly blocks the RESOLVED transition until the student submits a 1-to-</w:t>
+      </w:r>
+      <w:proofErr w:type="gramStart"/>
+      <w:r>
+        <w:rPr>
+          <w:rFonts w:ascii="Arial" w:hAnsi="Arial"/>
+          <w:color w:val="000000"/>
+          <w:sz w:val="23"/>
+        </w:rPr>
+        <w:t>5 star</w:t>
+      </w:r>
+      <w:proofErr w:type="gramEnd"/>
+      <w:r>
+        <w:rPr>
+          <w:rFonts w:ascii="Arial" w:hAnsi="Arial"/>
+          <w:color w:val="000000"/>
+          <w:sz w:val="23"/>
+        </w:rPr>
+        <w:t xml:space="preserve"> rating and optional comments.</w:t>
       </w:r>
     </w:p>
     <w:p>
@@ -11368,15 +13149,65 @@
           <w:color w:val="000000"/>
           <w:sz w:val="23"/>
         </w:rPr>
-        <w:t xml:space="preserve">Phase 3 (Develop): </w:t>
-      </w:r>
-      <w:r>
-        <w:rPr>
-          <w:rFonts w:ascii="Arial" w:hAnsi="Arial"/>
-          <w:color w:val="000000"/>
-          <w:sz w:val="23"/>
-        </w:rPr>
-        <w:t>Developed Java SE 21 HttpServer, BCrypt password hashing, JDBC connection management, ScheduledExecutorService daemon, and Bootstrap 5 frontend.</w:t>
+        <w:t xml:space="preserve">3. Canvas </w:t>
+      </w:r>
+      <w:proofErr w:type="spellStart"/>
+      <w:r>
+        <w:rPr>
+          <w:rFonts w:ascii="Arial" w:hAnsi="Arial"/>
+          <w:b/>
+          <w:color w:val="000000"/>
+          <w:sz w:val="23"/>
+        </w:rPr>
+        <w:t>Downsampling</w:t>
+      </w:r>
+      <w:proofErr w:type="spellEnd"/>
+      <w:r>
+        <w:rPr>
+          <w:rFonts w:ascii="Arial" w:hAnsi="Arial"/>
+          <w:b/>
+          <w:color w:val="000000"/>
+          <w:sz w:val="23"/>
+        </w:rPr>
+        <w:t xml:space="preserve">: </w:t>
+      </w:r>
+      <w:r>
+        <w:rPr>
+          <w:rFonts w:ascii="Arial" w:hAnsi="Arial"/>
+          <w:color w:val="000000"/>
+          <w:sz w:val="23"/>
+        </w:rPr>
+        <w:t>When a user attaches a photo, client-side JavaScript draws it onto an HTML5 &lt;canvas&gt;, resizes it to a maximum dimension of 1200px, and encodes it as JPEG (quality 0.75), reducing an 8 MB camera photo to &lt;120 KB.</w:t>
+      </w:r>
+    </w:p>
+    <w:p>
+      <w:pPr>
+        <w:keepNext/>
+        <w:spacing w:before="280" w:after="80"/>
+      </w:pPr>
+      <w:r>
+        <w:rPr>
+          <w:rFonts w:ascii="Arial" w:hAnsi="Arial"/>
+          <w:b/>
+          <w:color w:val="000000"/>
+          <w:sz w:val="24"/>
+        </w:rPr>
+        <w:t>4.2 FEATURES</w:t>
+      </w:r>
+    </w:p>
+    <w:p>
+      <w:pPr>
+        <w:keepNext/>
+        <w:spacing w:before="200" w:after="60"/>
+      </w:pPr>
+      <w:r>
+        <w:rPr>
+          <w:rFonts w:ascii="Arial" w:hAnsi="Arial"/>
+          <w:b/>
+          <w:color w:val="1E293B"/>
+          <w:sz w:val="23"/>
+        </w:rPr>
+        <w:t>4.2.1 Novelty of the Proposal</w:t>
       </w:r>
     </w:p>
     <w:p>
@@ -11401,651 +13232,15 @@
           <w:color w:val="000000"/>
           <w:sz w:val="23"/>
         </w:rPr>
-        <w:t xml:space="preserve">Phase 4 (Deploy): </w:t>
-      </w:r>
-      <w:r>
-        <w:rPr>
-          <w:rFonts w:ascii="Arial" w:hAnsi="Arial"/>
-          <w:color w:val="000000"/>
-          <w:sz w:val="23"/>
-        </w:rPr>
-        <w:t>Conducted multi-client stress testing, solved base64 data truncation bugs, verified CORS compliance, and executed live end-to-end demonstrations.</w:t>
-      </w:r>
-    </w:p>
-    <w:p>
-      <w:pPr>
-        <w:keepNext/>
-        <w:spacing w:before="200" w:after="60"/>
-      </w:pPr>
-      <w:r>
-        <w:rPr>
-          <w:rFonts w:ascii="Arial" w:hAnsi="Arial"/>
-          <w:b/>
-          <w:color w:val="1E293B"/>
-          <w:sz w:val="23"/>
-        </w:rPr>
-        <w:t>4.1.3 Internal or Component Design Structure</w:t>
-      </w:r>
-    </w:p>
-    <w:p>
-      <w:pPr>
-        <w:spacing w:after="120" w:line="300" w:lineRule="auto"/>
-        <w:jc w:val="both"/>
-      </w:pPr>
-      <w:r>
-        <w:rPr>
-          <w:rFonts w:ascii="Arial" w:hAnsi="Arial"/>
-          <w:color w:val="000000"/>
-          <w:sz w:val="24"/>
-        </w:rPr>
-        <w:t>The relational schema is modeled in Third Normal Form (3NF) to eradicate data anomalies. Figure 4.1 illustrates the complete Entity-Relationship diagram across the users, complaints, and complaint_actions tables:</w:t>
-      </w:r>
-    </w:p>
-    <w:p>
-      <w:pPr>
-        <w:spacing w:before="200" w:after="80"/>
-        <w:jc w:val="center"/>
-      </w:pPr>
-      <w:r>
-        <w:rPr>
-          <w:noProof/>
-        </w:rPr>
-        <w:drawing>
-          <wp:inline distT="0" distB="0" distL="0" distR="0" wp14:anchorId="50385997" wp14:editId="1CD1D431">
-            <wp:extent cx="5486400" cy="3569240"/>
-            <wp:effectExtent l="0" t="0" r="0" b="0"/>
-            <wp:docPr id="9" name="Picture 9"/>
-            <wp:cNvGraphicFramePr>
-              <a:graphicFrameLocks xmlns:a="http://schemas.openxmlformats.org/drawingml/2006/main" noChangeAspect="1"/>
-            </wp:cNvGraphicFramePr>
-            <a:graphic xmlns:a="http://schemas.openxmlformats.org/drawingml/2006/main">
-              <a:graphicData uri="http://schemas.openxmlformats.org/drawingml/2006/picture">
-                <pic:pic xmlns:pic="http://schemas.openxmlformats.org/drawingml/2006/picture">
-                  <pic:nvPicPr>
-                    <pic:cNvPr id="0" name="fig3_er_schema.png"/>
-                    <pic:cNvPicPr/>
-                  </pic:nvPicPr>
-                  <pic:blipFill>
-                    <a:blip r:embed="rId12"/>
-                    <a:stretch>
-                      <a:fillRect/>
-                    </a:stretch>
-                  </pic:blipFill>
-                  <pic:spPr>
-                    <a:xfrm>
-                      <a:off x="0" y="0"/>
-                      <a:ext cx="5486400" cy="3569240"/>
-                    </a:xfrm>
-                    <a:prstGeom prst="rect">
-                      <a:avLst/>
-                    </a:prstGeom>
-                  </pic:spPr>
-                </pic:pic>
-              </a:graphicData>
-            </a:graphic>
-          </wp:inline>
-        </w:drawing>
-      </w:r>
-    </w:p>
-    <w:p>
-      <w:pPr>
-        <w:spacing w:before="40" w:after="240"/>
-        <w:jc w:val="center"/>
-      </w:pPr>
-      <w:r>
-        <w:rPr>
-          <w:rFonts w:ascii="Arial" w:hAnsi="Arial"/>
-          <w:b/>
-          <w:i/>
-          <w:color w:val="334155"/>
-          <w:sz w:val="20"/>
-        </w:rPr>
-        <w:t>Figure 4.1: Relational Database Entity-Relationship Schema in Third Normal Form (3NF)</w:t>
-      </w:r>
-    </w:p>
-    <w:p>
-      <w:pPr>
-        <w:spacing w:after="120" w:line="300" w:lineRule="auto"/>
-        <w:jc w:val="both"/>
-      </w:pPr>
-      <w:r>
-        <w:rPr>
-          <w:rFonts w:ascii="Arial" w:hAnsi="Arial"/>
-          <w:color w:val="000000"/>
-          <w:sz w:val="24"/>
-        </w:rPr>
-        <w:t>The Data Definition Language (DDL) specifications for the core relational tables are structured as follows:</w:t>
-      </w:r>
-    </w:p>
-    <w:tbl>
-      <w:tblPr>
-        <w:tblW w:w="0" w:type="auto"/>
-        <w:jc w:val="center"/>
-        <w:tblLook w:val="04A0" w:firstRow="1" w:lastRow="0" w:firstColumn="1" w:lastColumn="0" w:noHBand="0" w:noVBand="1"/>
-      </w:tblPr>
-      <w:tblGrid>
-        <w:gridCol w:w="9026"/>
-      </w:tblGrid>
-      <w:tr>
-        <w:trPr>
-          <w:jc w:val="center"/>
-        </w:trPr>
-        <w:tc>
-          <w:tcPr>
-            <w:tcW w:w="9026" w:type="dxa"/>
-            <w:shd w:val="clear" w:color="auto" w:fill="F1F5F9"/>
-            <w:tcMar>
-              <w:top w:w="100" w:type="dxa"/>
-              <w:left w:w="150" w:type="dxa"/>
-              <w:bottom w:w="100" w:type="dxa"/>
-              <w:right w:w="150" w:type="dxa"/>
-            </w:tcMar>
-          </w:tcPr>
-          <w:p>
-            <w:pPr>
-              <w:spacing w:after="0"/>
-            </w:pPr>
-            <w:r>
-              <w:rPr>
-                <w:rFonts w:ascii="Consolas" w:hAnsi="Consolas"/>
-                <w:color w:val="0F172A"/>
-                <w:sz w:val="19"/>
-              </w:rPr>
-              <w:t>-- Table 1: users (User Authentication &amp; Roles)</w:t>
-            </w:r>
-            <w:r>
-              <w:rPr>
-                <w:rFonts w:ascii="Consolas" w:hAnsi="Consolas"/>
-                <w:color w:val="0F172A"/>
-                <w:sz w:val="19"/>
-              </w:rPr>
-              <w:br/>
-              <w:t>CREATE TABLE users (</w:t>
-            </w:r>
-            <w:r>
-              <w:rPr>
-                <w:rFonts w:ascii="Consolas" w:hAnsi="Consolas"/>
-                <w:color w:val="0F172A"/>
-                <w:sz w:val="19"/>
-              </w:rPr>
-              <w:br/>
-            </w:r>
-            <w:r>
-              <w:rPr>
-                <w:rFonts w:ascii="Consolas" w:hAnsi="Consolas"/>
-                <w:color w:val="0F172A"/>
-                <w:sz w:val="19"/>
-              </w:rPr>
-              <w:t xml:space="preserve">    id INT AUTO_INCREMENT PRIMARY KEY,</w:t>
-            </w:r>
-            <w:r>
-              <w:rPr>
-                <w:rFonts w:ascii="Consolas" w:hAnsi="Consolas"/>
-                <w:color w:val="0F172A"/>
-                <w:sz w:val="19"/>
-              </w:rPr>
-              <w:br/>
-            </w:r>
-            <w:r>
-              <w:rPr>
-                <w:rFonts w:ascii="Consolas" w:hAnsi="Consolas"/>
-                <w:color w:val="0F172A"/>
-                <w:sz w:val="19"/>
-              </w:rPr>
-              <w:lastRenderedPageBreak/>
-              <w:t xml:space="preserve">    name VARCHAR(100) NOT NULL,</w:t>
-            </w:r>
-            <w:r>
-              <w:rPr>
-                <w:rFonts w:ascii="Consolas" w:hAnsi="Consolas"/>
-                <w:color w:val="0F172A"/>
-                <w:sz w:val="19"/>
-              </w:rPr>
-              <w:br/>
-              <w:t xml:space="preserve">    email VARCHAR(100) NOT NULL UNIQUE,</w:t>
-            </w:r>
-            <w:r>
-              <w:rPr>
-                <w:rFonts w:ascii="Consolas" w:hAnsi="Consolas"/>
-                <w:color w:val="0F172A"/>
-                <w:sz w:val="19"/>
-              </w:rPr>
-              <w:br/>
-              <w:t xml:space="preserve">    password_hash VARCHAR(255) NOT NULL,</w:t>
-            </w:r>
-            <w:r>
-              <w:rPr>
-                <w:rFonts w:ascii="Consolas" w:hAnsi="Consolas"/>
-                <w:color w:val="0F172A"/>
-                <w:sz w:val="19"/>
-              </w:rPr>
-              <w:br/>
-              <w:t xml:space="preserve">    role ENUM('STUDENT', 'ADMIN', 'COORDINATOR', 'HOD', 'DEAN') DEFAULT 'STUDENT',</w:t>
-            </w:r>
-            <w:r>
-              <w:rPr>
-                <w:rFonts w:ascii="Consolas" w:hAnsi="Consolas"/>
-                <w:color w:val="0F172A"/>
-                <w:sz w:val="19"/>
-              </w:rPr>
-              <w:br/>
-              <w:t xml:space="preserve">    department VARCHAR(100) DEFAULT 'CSE',</w:t>
-            </w:r>
-            <w:r>
-              <w:rPr>
-                <w:rFonts w:ascii="Consolas" w:hAnsi="Consolas"/>
-                <w:color w:val="0F172A"/>
-                <w:sz w:val="19"/>
-              </w:rPr>
-              <w:br/>
-              <w:t xml:space="preserve">    created_at TIMESTAMP DEFAULT CURRENT_TIMESTAMP</w:t>
-            </w:r>
-            <w:r>
-              <w:rPr>
-                <w:rFonts w:ascii="Consolas" w:hAnsi="Consolas"/>
-                <w:color w:val="0F172A"/>
-                <w:sz w:val="19"/>
-              </w:rPr>
-              <w:br/>
-              <w:t>);</w:t>
-            </w:r>
-            <w:r>
-              <w:rPr>
-                <w:rFonts w:ascii="Consolas" w:hAnsi="Consolas"/>
-                <w:color w:val="0F172A"/>
-                <w:sz w:val="19"/>
-              </w:rPr>
-              <w:br/>
-            </w:r>
-            <w:r>
-              <w:rPr>
-                <w:rFonts w:ascii="Consolas" w:hAnsi="Consolas"/>
-                <w:color w:val="0F172A"/>
-                <w:sz w:val="19"/>
-              </w:rPr>
-              <w:br/>
-              <w:t>-- Table 2: complaints (Grievance Records &amp; SLA Tracking)</w:t>
-            </w:r>
-            <w:r>
-              <w:rPr>
-                <w:rFonts w:ascii="Consolas" w:hAnsi="Consolas"/>
-                <w:color w:val="0F172A"/>
-                <w:sz w:val="19"/>
-              </w:rPr>
-              <w:br/>
-              <w:t>CREATE TABLE complaints (</w:t>
-            </w:r>
-            <w:r>
-              <w:rPr>
-                <w:rFonts w:ascii="Consolas" w:hAnsi="Consolas"/>
-                <w:color w:val="0F172A"/>
-                <w:sz w:val="19"/>
-              </w:rPr>
-              <w:br/>
-              <w:t xml:space="preserve">    id INT AUTO_INCREMENT PRIMARY KEY,</w:t>
-            </w:r>
-            <w:r>
-              <w:rPr>
-                <w:rFonts w:ascii="Consolas" w:hAnsi="Consolas"/>
-                <w:color w:val="0F172A"/>
-                <w:sz w:val="19"/>
-              </w:rPr>
-              <w:br/>
-              <w:t xml:space="preserve">    tracking_id VARCHAR(50) NOT NULL UNIQUE,</w:t>
-            </w:r>
-            <w:r>
-              <w:rPr>
-                <w:rFonts w:ascii="Consolas" w:hAnsi="Consolas"/>
-                <w:color w:val="0F172A"/>
-                <w:sz w:val="19"/>
-              </w:rPr>
-              <w:br/>
-            </w:r>
-            <w:r>
-              <w:rPr>
-                <w:rFonts w:ascii="Consolas" w:hAnsi="Consolas"/>
-                <w:color w:val="0F172A"/>
-                <w:sz w:val="19"/>
-              </w:rPr>
-              <w:t xml:space="preserve">    user_id INT NOT NULL,</w:t>
-            </w:r>
-            <w:r>
-              <w:rPr>
-                <w:rFonts w:ascii="Consolas" w:hAnsi="Consolas"/>
-                <w:color w:val="0F172A"/>
-                <w:sz w:val="19"/>
-              </w:rPr>
-              <w:br/>
-              <w:t xml:space="preserve">    title VARCHAR(200) NOT NULL,</w:t>
-            </w:r>
-            <w:r>
-              <w:rPr>
-                <w:rFonts w:ascii="Consolas" w:hAnsi="Consolas"/>
-                <w:color w:val="0F172A"/>
-                <w:sz w:val="19"/>
-              </w:rPr>
-              <w:br/>
-              <w:t xml:space="preserve">    description TEXT NOT NULL,</w:t>
-            </w:r>
-            <w:r>
-              <w:rPr>
-                <w:rFonts w:ascii="Consolas" w:hAnsi="Consolas"/>
-                <w:color w:val="0F172A"/>
-                <w:sz w:val="19"/>
-              </w:rPr>
-              <w:br/>
-              <w:t xml:space="preserve">    category ENUM('Hostel', 'Academic', 'Mess', 'Infrastructure', 'Ragging', 'Other') NOT NULL,</w:t>
-            </w:r>
-            <w:r>
-              <w:rPr>
-                <w:rFonts w:ascii="Consolas" w:hAnsi="Consolas"/>
-                <w:color w:val="0F172A"/>
-                <w:sz w:val="19"/>
-              </w:rPr>
-              <w:br/>
-              <w:t xml:space="preserve">    priority ENUM('LOW', 'MEDIUM', 'HIGH', 'EMERGENCY') DEFAULT 'MEDIUM',</w:t>
-            </w:r>
-            <w:r>
-              <w:rPr>
-                <w:rFonts w:ascii="Consolas" w:hAnsi="Consolas"/>
-                <w:color w:val="0F172A"/>
-                <w:sz w:val="19"/>
-              </w:rPr>
-              <w:br/>
-              <w:t xml:space="preserve">    status ENUM('SUBMITTED', 'IN_PROGRESS', 'ACTION_TAKEN', 'RESOLVED') DEFAULT 'SUBMITTED',</w:t>
-            </w:r>
-            <w:r>
-              <w:rPr>
-                <w:rFonts w:ascii="Consolas" w:hAnsi="Consolas"/>
-                <w:color w:val="0F172A"/>
-                <w:sz w:val="19"/>
-              </w:rPr>
-              <w:br/>
-              <w:t xml:space="preserve">    escalation_level ENUM('COORDINATOR', 'HOD', 'DEAN') DEFAULT 'COORDINATOR',</w:t>
-            </w:r>
-            <w:r>
-              <w:rPr>
-                <w:rFonts w:ascii="Consolas" w:hAnsi="Consolas"/>
-                <w:color w:val="0F172A"/>
-                <w:sz w:val="19"/>
-              </w:rPr>
-              <w:br/>
-              <w:t xml:space="preserve">    attachment_path LONGTEXT,</w:t>
-            </w:r>
-            <w:r>
-              <w:rPr>
-                <w:rFonts w:ascii="Consolas" w:hAnsi="Consolas"/>
-                <w:color w:val="0F172A"/>
-                <w:sz w:val="19"/>
-              </w:rPr>
-              <w:br/>
-              <w:t xml:space="preserve">    rating TINYINT DEFAULT NULL,</w:t>
-            </w:r>
-            <w:r>
-              <w:rPr>
-                <w:rFonts w:ascii="Consolas" w:hAnsi="Consolas"/>
-                <w:color w:val="0F172A"/>
-                <w:sz w:val="19"/>
-              </w:rPr>
-              <w:br/>
-            </w:r>
-            <w:r>
-              <w:rPr>
-                <w:rFonts w:ascii="Consolas" w:hAnsi="Consolas"/>
-                <w:color w:val="0F172A"/>
-                <w:sz w:val="19"/>
-              </w:rPr>
-              <w:t xml:space="preserve">    feedback TEXT DEFAULT NULL,</w:t>
-            </w:r>
-            <w:r>
-              <w:rPr>
-                <w:rFonts w:ascii="Consolas" w:hAnsi="Consolas"/>
-                <w:color w:val="0F172A"/>
-                <w:sz w:val="19"/>
-              </w:rPr>
-              <w:br/>
-              <w:t xml:space="preserve">    created_at TIMESTAMP DEFAULT CURRENT_TIMESTAMP,</w:t>
-            </w:r>
-            <w:r>
-              <w:rPr>
-                <w:rFonts w:ascii="Consolas" w:hAnsi="Consolas"/>
-                <w:color w:val="0F172A"/>
-                <w:sz w:val="19"/>
-              </w:rPr>
-              <w:br/>
-              <w:t xml:space="preserve">    updated_at TIMESTAMP DEFAULT CURRENT_TIMESTAMP ON UPDATE CURRENT_TIMESTAMP,</w:t>
-            </w:r>
-            <w:r>
-              <w:rPr>
-                <w:rFonts w:ascii="Consolas" w:hAnsi="Consolas"/>
-                <w:color w:val="0F172A"/>
-                <w:sz w:val="19"/>
-              </w:rPr>
-              <w:br/>
-              <w:t xml:space="preserve">    FOREIGN KEY (user_id) REFERENCES users(id) ON DELETE CASCADE</w:t>
-            </w:r>
-            <w:r>
-              <w:rPr>
-                <w:rFonts w:ascii="Consolas" w:hAnsi="Consolas"/>
-                <w:color w:val="0F172A"/>
-                <w:sz w:val="19"/>
-              </w:rPr>
-              <w:br/>
-              <w:t>);</w:t>
-            </w:r>
-            <w:r>
-              <w:rPr>
-                <w:rFonts w:ascii="Consolas" w:hAnsi="Consolas"/>
-                <w:color w:val="0F172A"/>
-                <w:sz w:val="19"/>
-              </w:rPr>
-              <w:br/>
-            </w:r>
-            <w:r>
-              <w:rPr>
-                <w:rFonts w:ascii="Consolas" w:hAnsi="Consolas"/>
-                <w:color w:val="0F172A"/>
-                <w:sz w:val="19"/>
-              </w:rPr>
-              <w:br/>
-              <w:t>-- Table 3: complaint_actions (Audit Trail &amp; Activity Log)</w:t>
-            </w:r>
-            <w:r>
-              <w:rPr>
-                <w:rFonts w:ascii="Consolas" w:hAnsi="Consolas"/>
-                <w:color w:val="0F172A"/>
-                <w:sz w:val="19"/>
-              </w:rPr>
-              <w:br/>
-              <w:t>CREATE TABLE complaint_actions (</w:t>
-            </w:r>
-            <w:r>
-              <w:rPr>
-                <w:rFonts w:ascii="Consolas" w:hAnsi="Consolas"/>
-                <w:color w:val="0F172A"/>
-                <w:sz w:val="19"/>
-              </w:rPr>
-              <w:br/>
-              <w:t xml:space="preserve">    id INT AUTO_INCREMENT PRIMARY KEY,</w:t>
-            </w:r>
-            <w:r>
-              <w:rPr>
-                <w:rFonts w:ascii="Consolas" w:hAnsi="Consolas"/>
-                <w:color w:val="0F172A"/>
-                <w:sz w:val="19"/>
-              </w:rPr>
-              <w:br/>
-              <w:t xml:space="preserve">    complaint_id INT NOT NULL,</w:t>
-            </w:r>
-            <w:r>
-              <w:rPr>
-                <w:rFonts w:ascii="Consolas" w:hAnsi="Consolas"/>
-                <w:color w:val="0F172A"/>
-                <w:sz w:val="19"/>
-              </w:rPr>
-              <w:br/>
-              <w:t xml:space="preserve">    action_by INT NOT NULL,</w:t>
-            </w:r>
-            <w:r>
-              <w:rPr>
-                <w:rFonts w:ascii="Consolas" w:hAnsi="Consolas"/>
-                <w:color w:val="0F172A"/>
-                <w:sz w:val="19"/>
-              </w:rPr>
-              <w:br/>
-              <w:t xml:space="preserve">    action_type VARCHAR(50) NOT NULL,</w:t>
-            </w:r>
-            <w:r>
-              <w:rPr>
-                <w:rFonts w:ascii="Consolas" w:hAnsi="Consolas"/>
-                <w:color w:val="0F172A"/>
-                <w:sz w:val="19"/>
-              </w:rPr>
-              <w:br/>
-              <w:t xml:space="preserve">    comments TEXT,</w:t>
-            </w:r>
-            <w:r>
-              <w:rPr>
-                <w:rFonts w:ascii="Consolas" w:hAnsi="Consolas"/>
-                <w:color w:val="0F172A"/>
-                <w:sz w:val="19"/>
-              </w:rPr>
-              <w:br/>
-            </w:r>
-            <w:r>
-              <w:rPr>
-                <w:rFonts w:ascii="Consolas" w:hAnsi="Consolas"/>
-                <w:color w:val="0F172A"/>
-                <w:sz w:val="19"/>
-              </w:rPr>
-              <w:t xml:space="preserve">    action_timestamp TIMESTAMP DEFAULT CURRENT_TIMESTAMP,</w:t>
-            </w:r>
-            <w:r>
-              <w:rPr>
-                <w:rFonts w:ascii="Consolas" w:hAnsi="Consolas"/>
-                <w:color w:val="0F172A"/>
-                <w:sz w:val="19"/>
-              </w:rPr>
-              <w:br/>
-              <w:t xml:space="preserve">    FOREIGN KEY (complaint_id) REFERENCES complaints(id) ON DELETE CASCADE,</w:t>
-            </w:r>
-            <w:r>
-              <w:rPr>
-                <w:rFonts w:ascii="Consolas" w:hAnsi="Consolas"/>
-                <w:color w:val="0F172A"/>
-                <w:sz w:val="19"/>
-              </w:rPr>
-              <w:br/>
-              <w:t xml:space="preserve">    FOREIGN KEY (action_by) REFERENCES users(id) ON DELETE CASCADE</w:t>
-            </w:r>
-            <w:r>
-              <w:rPr>
-                <w:rFonts w:ascii="Consolas" w:hAnsi="Consolas"/>
-                <w:color w:val="0F172A"/>
-                <w:sz w:val="19"/>
-              </w:rPr>
-              <w:br/>
-              <w:t>);</w:t>
-            </w:r>
-          </w:p>
-        </w:tc>
-      </w:tr>
-    </w:tbl>
-    <w:p>
-      <w:pPr>
-        <w:spacing w:after="120"/>
-      </w:pPr>
-    </w:p>
-    <w:p>
-      <w:pPr>
-        <w:keepNext/>
-        <w:spacing w:before="200" w:after="60"/>
-      </w:pPr>
-      <w:r>
-        <w:rPr>
-          <w:rFonts w:ascii="Arial" w:hAnsi="Arial"/>
-          <w:b/>
-          <w:color w:val="1E293B"/>
-          <w:sz w:val="23"/>
-        </w:rPr>
-        <w:t>4.1.4 Working Principles</w:t>
-      </w:r>
-    </w:p>
-    <w:p>
-      <w:pPr>
-        <w:spacing w:after="120" w:line="300" w:lineRule="auto"/>
-        <w:jc w:val="both"/>
-      </w:pPr>
-      <w:r>
-        <w:rPr>
-          <w:rFonts w:ascii="Arial" w:hAnsi="Arial"/>
-          <w:color w:val="000000"/>
-          <w:sz w:val="24"/>
-        </w:rPr>
-        <w:t>Figure 2.1 traces the complete state lifecycle and algorithmic decision branches executed during grievance processing:</w:t>
-      </w:r>
-    </w:p>
-    <w:p>
-      <w:pPr>
-        <w:spacing w:before="200" w:after="80"/>
-        <w:jc w:val="center"/>
-      </w:pPr>
-      <w:r>
-        <w:rPr>
-          <w:noProof/>
-        </w:rPr>
-        <w:lastRenderedPageBreak/>
-        <w:drawing>
-          <wp:inline distT="0" distB="0" distL="0" distR="0" wp14:anchorId="38C62994" wp14:editId="2535DB13">
-            <wp:extent cx="5486400" cy="3546764"/>
-            <wp:effectExtent l="0" t="0" r="0" b="0"/>
-            <wp:docPr id="10" name="Picture 10"/>
-            <wp:cNvGraphicFramePr>
-              <a:graphicFrameLocks xmlns:a="http://schemas.openxmlformats.org/drawingml/2006/main" noChangeAspect="1"/>
-            </wp:cNvGraphicFramePr>
-            <a:graphic xmlns:a="http://schemas.openxmlformats.org/drawingml/2006/main">
-              <a:graphicData uri="http://schemas.openxmlformats.org/drawingml/2006/picture">
-                <pic:pic xmlns:pic="http://schemas.openxmlformats.org/drawingml/2006/picture">
-                  <pic:nvPicPr>
-                    <pic:cNvPr id="0" name="fig2_workflow.png"/>
-                    <pic:cNvPicPr/>
-                  </pic:nvPicPr>
-                  <pic:blipFill>
-                    <a:blip r:embed="rId13"/>
-                    <a:stretch>
-                      <a:fillRect/>
-                    </a:stretch>
-                  </pic:blipFill>
-                  <pic:spPr>
-                    <a:xfrm>
-                      <a:off x="0" y="0"/>
-                      <a:ext cx="5486400" cy="3546764"/>
-                    </a:xfrm>
-                    <a:prstGeom prst="rect">
-                      <a:avLst/>
-                    </a:prstGeom>
-                  </pic:spPr>
-                </pic:pic>
-              </a:graphicData>
-            </a:graphic>
-          </wp:inline>
-        </w:drawing>
-      </w:r>
-    </w:p>
-    <w:p>
-      <w:pPr>
-        <w:spacing w:before="40" w:after="240"/>
-        <w:jc w:val="center"/>
-      </w:pPr>
-      <w:r>
-        <w:rPr>
-          <w:rFonts w:ascii="Arial" w:hAnsi="Arial"/>
-          <w:b/>
-          <w:i/>
-          <w:color w:val="334155"/>
-          <w:sz w:val="20"/>
-        </w:rPr>
-        <w:t>Figure 2.1: Grievance Lifecycle &amp; Multi-Tier SLA Escalation State Flowchart</w:t>
+        <w:t xml:space="preserve">Zero-Framework Lean Architecture: </w:t>
+      </w:r>
+      <w:r>
+        <w:rPr>
+          <w:rFonts w:ascii="Arial" w:hAnsi="Arial"/>
+          <w:color w:val="000000"/>
+          <w:sz w:val="23"/>
+        </w:rPr>
+        <w:t>Bypasses the 150+ MB memory bloat and multi-second startup latency of Spring Boot, delivering sub-400ms startup directly on native Java SE.</w:t>
       </w:r>
     </w:p>
     <w:p>
@@ -12070,15 +13265,15 @@
           <w:color w:val="000000"/>
           <w:sz w:val="23"/>
         </w:rPr>
-        <w:t xml:space="preserve">1. SLA Escalation Engine: </w:t>
-      </w:r>
-      <w:r>
-        <w:rPr>
-          <w:rFonts w:ascii="Arial" w:hAnsi="Arial"/>
-          <w:color w:val="000000"/>
-          <w:sz w:val="23"/>
-        </w:rPr>
-        <w:t>Upon ticket submission, a Java ScheduledExecutorService daemon awakens hourly to calculate elapsed time via TIMESTAMPDIFF(HOUR, created_at, NOW()). If the ticket remains in SUBMITTED state past 24 hours, escalation_level auto-promotes to HOD. Past 48 hours, it auto-promotes to DEAN.</w:t>
+        <w:t xml:space="preserve">Anti-Fraud Student Veto Lock: </w:t>
+      </w:r>
+      <w:r>
+        <w:rPr>
+          <w:rFonts w:ascii="Arial" w:hAnsi="Arial"/>
+          <w:color w:val="000000"/>
+          <w:sz w:val="23"/>
+        </w:rPr>
+        <w:t>Reverses traditional administrative power dynamics by giving students veto authority over ticket closure through mandatory rating gates.</w:t>
       </w:r>
     </w:p>
     <w:p>
@@ -12103,168 +13298,6 @@
           <w:color w:val="000000"/>
           <w:sz w:val="23"/>
         </w:rPr>
-        <w:t xml:space="preserve">2. Closed-Loop Rating Lock: </w:t>
-      </w:r>
-      <w:r>
-        <w:rPr>
-          <w:rFonts w:ascii="Arial" w:hAnsi="Arial"/>
-          <w:color w:val="000000"/>
-          <w:sz w:val="23"/>
-        </w:rPr>
-        <w:t>When a coordinator executes a repair, they transition the ticket to ACTION_TAKEN. The backend strictly blocks the RESOLVED transition until the student submits a 1-to-5 star rating and optional comments.</w:t>
-      </w:r>
-    </w:p>
-    <w:p>
-      <w:pPr>
-        <w:spacing w:after="80" w:line="288" w:lineRule="auto"/>
-        <w:ind w:left="360"/>
-        <w:jc w:val="both"/>
-      </w:pPr>
-      <w:r>
-        <w:rPr>
-          <w:rFonts w:ascii="Arial" w:hAnsi="Arial"/>
-          <w:b/>
-          <w:color w:val="1D4ED8"/>
-          <w:sz w:val="23"/>
-        </w:rPr>
-        <w:t xml:space="preserve">•  </w:t>
-      </w:r>
-      <w:r>
-        <w:rPr>
-          <w:rFonts w:ascii="Arial" w:hAnsi="Arial"/>
-          <w:b/>
-          <w:color w:val="000000"/>
-          <w:sz w:val="23"/>
-        </w:rPr>
-        <w:t xml:space="preserve">3. Canvas Downsampling: </w:t>
-      </w:r>
-      <w:r>
-        <w:rPr>
-          <w:rFonts w:ascii="Arial" w:hAnsi="Arial"/>
-          <w:color w:val="000000"/>
-          <w:sz w:val="23"/>
-        </w:rPr>
-        <w:t>When a user attaches a photo, client-side JavaScript draws it onto an HTML5 &lt;canvas&gt;, resizes it to a maximum dimension of 1200px, and encodes it as JPEG (quality 0.75), reducing an 8 MB camera photo to &lt;120 KB.</w:t>
-      </w:r>
-    </w:p>
-    <w:p>
-      <w:pPr>
-        <w:keepNext/>
-        <w:spacing w:before="280" w:after="80"/>
-      </w:pPr>
-      <w:r>
-        <w:rPr>
-          <w:rFonts w:ascii="Arial" w:hAnsi="Arial"/>
-          <w:b/>
-          <w:color w:val="000000"/>
-          <w:sz w:val="24"/>
-        </w:rPr>
-        <w:t>4.2 FEATURES</w:t>
-      </w:r>
-    </w:p>
-    <w:p>
-      <w:pPr>
-        <w:keepNext/>
-        <w:spacing w:before="200" w:after="60"/>
-      </w:pPr>
-      <w:r>
-        <w:rPr>
-          <w:rFonts w:ascii="Arial" w:hAnsi="Arial"/>
-          <w:b/>
-          <w:color w:val="1E293B"/>
-          <w:sz w:val="23"/>
-        </w:rPr>
-        <w:t>4.2.1 Novelty of the Proposal</w:t>
-      </w:r>
-    </w:p>
-    <w:p>
-      <w:pPr>
-        <w:spacing w:after="80" w:line="288" w:lineRule="auto"/>
-        <w:ind w:left="360"/>
-        <w:jc w:val="both"/>
-      </w:pPr>
-      <w:r>
-        <w:rPr>
-          <w:rFonts w:ascii="Arial" w:hAnsi="Arial"/>
-          <w:b/>
-          <w:color w:val="1D4ED8"/>
-          <w:sz w:val="23"/>
-        </w:rPr>
-        <w:t xml:space="preserve">•  </w:t>
-      </w:r>
-      <w:r>
-        <w:rPr>
-          <w:rFonts w:ascii="Arial" w:hAnsi="Arial"/>
-          <w:b/>
-          <w:color w:val="000000"/>
-          <w:sz w:val="23"/>
-        </w:rPr>
-        <w:t xml:space="preserve">Zero-Framework Lean Architecture: </w:t>
-      </w:r>
-      <w:r>
-        <w:rPr>
-          <w:rFonts w:ascii="Arial" w:hAnsi="Arial"/>
-          <w:color w:val="000000"/>
-          <w:sz w:val="23"/>
-        </w:rPr>
-        <w:t>Bypasses the 150+ MB memory bloat and multi-second startup latency of Spring Boot, delivering sub-400ms startup directly on native Java SE.</w:t>
-      </w:r>
-    </w:p>
-    <w:p>
-      <w:pPr>
-        <w:spacing w:after="80" w:line="288" w:lineRule="auto"/>
-        <w:ind w:left="360"/>
-        <w:jc w:val="both"/>
-      </w:pPr>
-      <w:r>
-        <w:rPr>
-          <w:rFonts w:ascii="Arial" w:hAnsi="Arial"/>
-          <w:b/>
-          <w:color w:val="1D4ED8"/>
-          <w:sz w:val="23"/>
-        </w:rPr>
-        <w:t xml:space="preserve">•  </w:t>
-      </w:r>
-      <w:r>
-        <w:rPr>
-          <w:rFonts w:ascii="Arial" w:hAnsi="Arial"/>
-          <w:b/>
-          <w:color w:val="000000"/>
-          <w:sz w:val="23"/>
-        </w:rPr>
-        <w:t xml:space="preserve">Anti-Fraud Student Veto Lock: </w:t>
-      </w:r>
-      <w:r>
-        <w:rPr>
-          <w:rFonts w:ascii="Arial" w:hAnsi="Arial"/>
-          <w:color w:val="000000"/>
-          <w:sz w:val="23"/>
-        </w:rPr>
-        <w:t>Reverses traditional administrative power dynamics by giving students veto authority over ticket closure through mandatory rating gates.</w:t>
-      </w:r>
-    </w:p>
-    <w:p>
-      <w:pPr>
-        <w:spacing w:after="80" w:line="288" w:lineRule="auto"/>
-        <w:ind w:left="360"/>
-        <w:jc w:val="both"/>
-      </w:pPr>
-      <w:r>
-        <w:rPr>
-          <w:rFonts w:ascii="Arial" w:hAnsi="Arial"/>
-          <w:b/>
-          <w:color w:val="1D4ED8"/>
-          <w:sz w:val="23"/>
-        </w:rPr>
-        <w:t xml:space="preserve">•  </w:t>
-      </w:r>
-      <w:r>
-        <w:rPr>
-          <w:rFonts w:ascii="Arial" w:hAnsi="Arial"/>
-          <w:b/>
-          <w:color w:val="000000"/>
-          <w:sz w:val="23"/>
-        </w:rPr>
         <w:t xml:space="preserve">Tamper-Proof Temporal Governance: </w:t>
       </w:r>
       <w:r>
@@ -12276,12 +13309,7 @@
         <w:t>Eliminates administrative bias; tickets escalate autonomously based on mathematical clock cycles rather than subjective human intervention.</w:t>
       </w:r>
     </w:p>
-    <w:p>
-      <w:r>
-        <w:lastRenderedPageBreak/>
-        <w:br w:type="page"/>
-      </w:r>
-    </w:p>
+    <w:p/>
     <w:p>
       <w:pPr>
         <w:keepNext/>
@@ -12295,7 +13323,6 @@
           <w:color w:val="000000"/>
           <w:sz w:val="28"/>
         </w:rPr>
-        <w:lastRenderedPageBreak/>
         <w:t>CHAPTER 5</w:t>
       </w:r>
     </w:p>
@@ -12425,8 +13452,19 @@
                 <w:color w:val="FFFFFF"/>
                 <w:sz w:val="19"/>
               </w:rPr>
-              <w:t>Observed System Behavior</w:t>
-            </w:r>
+              <w:t xml:space="preserve">Observed System </w:t>
+            </w:r>
+            <w:proofErr w:type="spellStart"/>
+            <w:r>
+              <w:rPr>
+                <w:rFonts w:ascii="Arial" w:hAnsi="Arial"/>
+                <w:b/>
+                <w:color w:val="FFFFFF"/>
+                <w:sz w:val="19"/>
+              </w:rPr>
+              <w:t>Behavior</w:t>
+            </w:r>
+            <w:proofErr w:type="spellEnd"/>
           </w:p>
         </w:tc>
         <w:tc>
@@ -12609,7 +13647,23 @@
                 <w:rFonts w:ascii="Arial" w:hAnsi="Arial"/>
                 <w:sz w:val="18"/>
               </w:rPr>
-              <w:t>Escalation engine increments escalation_level from COORDINATOR to HOD</w:t>
+              <w:t xml:space="preserve">Escalation engine increments </w:t>
+            </w:r>
+            <w:proofErr w:type="spellStart"/>
+            <w:r>
+              <w:rPr>
+                <w:rFonts w:ascii="Arial" w:hAnsi="Arial"/>
+                <w:sz w:val="18"/>
+              </w:rPr>
+              <w:t>escalation_level</w:t>
+            </w:r>
+            <w:proofErr w:type="spellEnd"/>
+            <w:r>
+              <w:rPr>
+                <w:rFonts w:ascii="Arial" w:hAnsi="Arial"/>
+                <w:sz w:val="18"/>
+              </w:rPr>
+              <w:t xml:space="preserve"> from COORDINATOR to HOD</w:t>
             </w:r>
           </w:p>
         </w:tc>
@@ -12701,7 +13755,23 @@
                 <w:rFonts w:ascii="Arial" w:hAnsi="Arial"/>
                 <w:sz w:val="18"/>
               </w:rPr>
-              <w:t>Escalation engine increments escalation_level from HOD to DEAN with alert flag</w:t>
+              <w:t xml:space="preserve">Escalation engine increments </w:t>
+            </w:r>
+            <w:proofErr w:type="spellStart"/>
+            <w:r>
+              <w:rPr>
+                <w:rFonts w:ascii="Arial" w:hAnsi="Arial"/>
+                <w:sz w:val="18"/>
+              </w:rPr>
+              <w:t>escalation_level</w:t>
+            </w:r>
+            <w:proofErr w:type="spellEnd"/>
+            <w:r>
+              <w:rPr>
+                <w:rFonts w:ascii="Arial" w:hAnsi="Arial"/>
+                <w:sz w:val="18"/>
+              </w:rPr>
+              <w:t xml:space="preserve"> from HOD to DEAN with alert flag</w:t>
             </w:r>
           </w:p>
         </w:tc>
@@ -13067,7 +14137,7 @@
                     <pic:cNvPicPr/>
                   </pic:nvPicPr>
                   <pic:blipFill>
-                    <a:blip r:embed="rId14"/>
+                    <a:blip r:embed="rId13"/>
                     <a:stretch>
                       <a:fillRect/>
                     </a:stretch>
@@ -13134,7 +14204,25 @@
           <w:color w:val="000000"/>
           <w:sz w:val="23"/>
         </w:rPr>
-        <w:t>The native Java HttpServer initializes and opens port 8080 in exactly 380 milliseconds, compared to 8.2 seconds for a standard Spring Boot application.</w:t>
+        <w:t xml:space="preserve">The native Java </w:t>
+      </w:r>
+      <w:proofErr w:type="spellStart"/>
+      <w:r>
+        <w:rPr>
+          <w:rFonts w:ascii="Arial" w:hAnsi="Arial"/>
+          <w:color w:val="000000"/>
+          <w:sz w:val="23"/>
+        </w:rPr>
+        <w:t>HttpServer</w:t>
+      </w:r>
+      <w:proofErr w:type="spellEnd"/>
+      <w:r>
+        <w:rPr>
+          <w:rFonts w:ascii="Arial" w:hAnsi="Arial"/>
+          <w:color w:val="000000"/>
+          <w:sz w:val="23"/>
+        </w:rPr>
+        <w:t xml:space="preserve"> initializes and opens port 8080 in exactly 380 milliseconds, compared to 8.2 seconds for a standard Spring Boot application.</w:t>
       </w:r>
     </w:p>
     <w:p>
@@ -13167,7 +14255,79 @@
           <w:color w:val="000000"/>
           <w:sz w:val="23"/>
         </w:rPr>
-        <w:t>Under sequential loads of 100 requests, GET /api/complaints/all averaged 11.4 ms, and POST /api/complaints averaged 24.2 ms.</w:t>
+        <w:t>Under sequential loads of 100 requests, GET /</w:t>
+      </w:r>
+      <w:proofErr w:type="spellStart"/>
+      <w:r>
+        <w:rPr>
+          <w:rFonts w:ascii="Arial" w:hAnsi="Arial"/>
+          <w:color w:val="000000"/>
+          <w:sz w:val="23"/>
+        </w:rPr>
+        <w:t>api</w:t>
+      </w:r>
+      <w:proofErr w:type="spellEnd"/>
+      <w:r>
+        <w:rPr>
+          <w:rFonts w:ascii="Arial" w:hAnsi="Arial"/>
+          <w:color w:val="000000"/>
+          <w:sz w:val="23"/>
+        </w:rPr>
+        <w:t xml:space="preserve">/complaints/all averaged 11.4 </w:t>
+      </w:r>
+      <w:proofErr w:type="spellStart"/>
+      <w:r>
+        <w:rPr>
+          <w:rFonts w:ascii="Arial" w:hAnsi="Arial"/>
+          <w:color w:val="000000"/>
+          <w:sz w:val="23"/>
+        </w:rPr>
+        <w:t>ms</w:t>
+      </w:r>
+      <w:proofErr w:type="spellEnd"/>
+      <w:r>
+        <w:rPr>
+          <w:rFonts w:ascii="Arial" w:hAnsi="Arial"/>
+          <w:color w:val="000000"/>
+          <w:sz w:val="23"/>
+        </w:rPr>
+        <w:t>, and POST /</w:t>
+      </w:r>
+      <w:proofErr w:type="spellStart"/>
+      <w:r>
+        <w:rPr>
+          <w:rFonts w:ascii="Arial" w:hAnsi="Arial"/>
+          <w:color w:val="000000"/>
+          <w:sz w:val="23"/>
+        </w:rPr>
+        <w:t>api</w:t>
+      </w:r>
+      <w:proofErr w:type="spellEnd"/>
+      <w:r>
+        <w:rPr>
+          <w:rFonts w:ascii="Arial" w:hAnsi="Arial"/>
+          <w:color w:val="000000"/>
+          <w:sz w:val="23"/>
+        </w:rPr>
+        <w:t xml:space="preserve">/complaints averaged 24.2 </w:t>
+      </w:r>
+      <w:proofErr w:type="spellStart"/>
+      <w:r>
+        <w:rPr>
+          <w:rFonts w:ascii="Arial" w:hAnsi="Arial"/>
+          <w:color w:val="000000"/>
+          <w:sz w:val="23"/>
+        </w:rPr>
+        <w:t>ms</w:t>
+      </w:r>
+      <w:proofErr w:type="spellEnd"/>
+      <w:r>
+        <w:rPr>
+          <w:rFonts w:ascii="Arial" w:hAnsi="Arial"/>
+          <w:color w:val="000000"/>
+          <w:sz w:val="23"/>
+        </w:rPr>
+        <w:t>.</w:t>
       </w:r>
     </w:p>
     <w:p>
@@ -13200,7 +14360,25 @@
           <w:color w:val="000000"/>
           <w:sz w:val="23"/>
         </w:rPr>
-        <w:t>An 8.2 MB raw camera photograph was compressed to 118 KB in 84 ms on the client device, saving 98.5% of database storage and network bandwidth.</w:t>
+        <w:t xml:space="preserve">An 8.2 MB raw camera photograph was compressed to 118 KB in 84 </w:t>
+      </w:r>
+      <w:proofErr w:type="spellStart"/>
+      <w:r>
+        <w:rPr>
+          <w:rFonts w:ascii="Arial" w:hAnsi="Arial"/>
+          <w:color w:val="000000"/>
+          <w:sz w:val="23"/>
+        </w:rPr>
+        <w:t>ms</w:t>
+      </w:r>
+      <w:proofErr w:type="spellEnd"/>
+      <w:r>
+        <w:rPr>
+          <w:rFonts w:ascii="Arial" w:hAnsi="Arial"/>
+          <w:color w:val="000000"/>
+          <w:sz w:val="23"/>
+        </w:rPr>
+        <w:t xml:space="preserve"> on the client device, saving 98.5% of database storage and network bandwidth.</w:t>
       </w:r>
     </w:p>
     <w:p>
@@ -13229,15 +14407,25 @@
           <w:color w:val="000000"/>
           <w:sz w:val="24"/>
         </w:rPr>
-        <w:t>During live operational evaluation, a grievance titled 'Water pipe leakage in Room 204' was submitted by student Sanjai. The system assigned tracking code CMP-7F19E3. The student dashboard rendered a live countdown starting at 48:00:00. Simultaneously, the complaint surfaced in the Coordinator's dashboard. Technicians inspected the leak, replaced the damaged valve, and logged 'Pipe repaired and valve replaced' at elapsed hour 14. The status transitioned to ACTION_TAKEN. The student inspected the completed r</w:t>
-      </w:r>
+        <w:t xml:space="preserve">During live operational evaluation, a grievance titled 'Water pipe leakage in Room 204' was submitted by student Sanjai. The system assigned tracking code CMP-7F19E3. The student dashboard rendered a live countdown starting at 48:00:00. Simultaneously, the complaint surfaced in the </w:t>
+      </w:r>
+      <w:proofErr w:type="gramStart"/>
       <w:r>
         <w:rPr>
           <w:rFonts w:ascii="Arial" w:hAnsi="Arial"/>
           <w:color w:val="000000"/>
           <w:sz w:val="24"/>
         </w:rPr>
-        <w:t>epair, assigned 5 stars with comment 'Repaired promptly, thank you', and submitted. The ticket successfully transitioned to RESOLVED with complete audit logs intact.</w:t>
+        <w:t>Coordinator's</w:t>
+      </w:r>
+      <w:proofErr w:type="gramEnd"/>
+      <w:r>
+        <w:rPr>
+          <w:rFonts w:ascii="Arial" w:hAnsi="Arial"/>
+          <w:color w:val="000000"/>
+          <w:sz w:val="24"/>
+        </w:rPr>
+        <w:t xml:space="preserve"> dashboard. Technicians inspected the leak, replaced the damaged valve, and logged 'Pipe repaired and valve replaced' at elapsed hour 14. The status transitioned to ACTION_TAKEN. The student inspected the completed repair, assigned 5 stars with comment 'Repaired promptly, thank you', and submitted. The ticket successfully transitioned to RESOLVED with complete audit logs intact.</w:t>
       </w:r>
     </w:p>
     <w:p>
@@ -13285,7 +14473,43 @@
           <w:color w:val="000000"/>
           <w:sz w:val="23"/>
         </w:rPr>
-        <w:t>Early tests failed when saving camera photos with 'Data truncation for column attachment_path'. Root cause: base64 strings exceeded VARCHAR(255). Resolution: Altered column to MySQL LONGTEXT and enforced client-side canvas compression.</w:t>
+        <w:t xml:space="preserve">Early tests failed when saving camera photos with 'Data truncation for column </w:t>
+      </w:r>
+      <w:proofErr w:type="spellStart"/>
+      <w:r>
+        <w:rPr>
+          <w:rFonts w:ascii="Arial" w:hAnsi="Arial"/>
+          <w:color w:val="000000"/>
+          <w:sz w:val="23"/>
+        </w:rPr>
+        <w:t>attachment_path</w:t>
+      </w:r>
+      <w:proofErr w:type="spellEnd"/>
+      <w:r>
+        <w:rPr>
+          <w:rFonts w:ascii="Arial" w:hAnsi="Arial"/>
+          <w:color w:val="000000"/>
+          <w:sz w:val="23"/>
+        </w:rPr>
+        <w:t xml:space="preserve">'. Root cause: base64 strings exceeded </w:t>
+      </w:r>
+      <w:proofErr w:type="gramStart"/>
+      <w:r>
+        <w:rPr>
+          <w:rFonts w:ascii="Arial" w:hAnsi="Arial"/>
+          <w:color w:val="000000"/>
+          <w:sz w:val="23"/>
+        </w:rPr>
+        <w:t>VARCHAR(</w:t>
+      </w:r>
+      <w:proofErr w:type="gramEnd"/>
+      <w:r>
+        <w:rPr>
+          <w:rFonts w:ascii="Arial" w:hAnsi="Arial"/>
+          <w:color w:val="000000"/>
+          <w:sz w:val="23"/>
+        </w:rPr>
+        <w:t>255). Resolution: Altered column to MySQL LONGTEXT and enforced client-side canvas compression.</w:t>
       </w:r>
     </w:p>
     <w:p>
@@ -13318,7 +14542,63 @@
           <w:color w:val="000000"/>
           <w:sz w:val="23"/>
         </w:rPr>
-        <w:t xml:space="preserve">The database rejected connections with 'mysqli::real_connect(): (HY000/2002)'. Root cause: MariaDB daemon had terminated </w:t>
+        <w:t>The database rejected connections with '</w:t>
+      </w:r>
+      <w:proofErr w:type="spellStart"/>
+      <w:proofErr w:type="gramStart"/>
+      <w:r>
+        <w:rPr>
+          <w:rFonts w:ascii="Arial" w:hAnsi="Arial"/>
+          <w:color w:val="000000"/>
+          <w:sz w:val="23"/>
+        </w:rPr>
+        <w:t>mysqli</w:t>
+      </w:r>
+      <w:proofErr w:type="spellEnd"/>
+      <w:r>
+        <w:rPr>
+          <w:rFonts w:ascii="Arial" w:hAnsi="Arial"/>
+          <w:color w:val="000000"/>
+          <w:sz w:val="23"/>
+        </w:rPr>
+        <w:t>::</w:t>
+      </w:r>
+      <w:proofErr w:type="spellStart"/>
+      <w:proofErr w:type="gramEnd"/>
+      <w:r>
+        <w:rPr>
+          <w:rFonts w:ascii="Arial" w:hAnsi="Arial"/>
+          <w:color w:val="000000"/>
+          <w:sz w:val="23"/>
+        </w:rPr>
+        <w:t>real_</w:t>
+      </w:r>
+      <w:proofErr w:type="gramStart"/>
+      <w:r>
+        <w:rPr>
+          <w:rFonts w:ascii="Arial" w:hAnsi="Arial"/>
+          <w:color w:val="000000"/>
+          <w:sz w:val="23"/>
+        </w:rPr>
+        <w:t>connect</w:t>
+      </w:r>
+      <w:proofErr w:type="spellEnd"/>
+      <w:r>
+        <w:rPr>
+          <w:rFonts w:ascii="Arial" w:hAnsi="Arial"/>
+          <w:color w:val="000000"/>
+          <w:sz w:val="23"/>
+        </w:rPr>
+        <w:t>(</w:t>
+      </w:r>
+      <w:proofErr w:type="gramEnd"/>
+      <w:r>
+        <w:rPr>
+          <w:rFonts w:ascii="Arial" w:hAnsi="Arial"/>
+          <w:color w:val="000000"/>
+          <w:sz w:val="23"/>
+        </w:rPr>
+        <w:t xml:space="preserve">): (HY000/2002)'. Root cause: MariaDB daemon had terminated </w:t>
       </w:r>
       <w:r>
         <w:rPr>
@@ -13360,7 +14640,25 @@
           <w:color w:val="000000"/>
           <w:sz w:val="23"/>
         </w:rPr>
-        <w:t>Concurrent status updates occasionally triggered row contention. Resolution: Refactored DAO updates into atomic transactional blocks with PreparedStatement isolation.</w:t>
+        <w:t xml:space="preserve">Concurrent status updates occasionally triggered row contention. Resolution: Refactored DAO updates into atomic transactional blocks with </w:t>
+      </w:r>
+      <w:proofErr w:type="spellStart"/>
+      <w:r>
+        <w:rPr>
+          <w:rFonts w:ascii="Arial" w:hAnsi="Arial"/>
+          <w:color w:val="000000"/>
+          <w:sz w:val="23"/>
+        </w:rPr>
+        <w:t>PreparedStatement</w:t>
+      </w:r>
+      <w:proofErr w:type="spellEnd"/>
+      <w:r>
+        <w:rPr>
+          <w:rFonts w:ascii="Arial" w:hAnsi="Arial"/>
+          <w:color w:val="000000"/>
+          <w:sz w:val="23"/>
+        </w:rPr>
+        <w:t xml:space="preserve"> isolation.</w:t>
       </w:r>
     </w:p>
     <w:p>
@@ -13427,15 +14725,7 @@
           <w:color w:val="000000"/>
           <w:sz w:val="24"/>
         </w:rPr>
-        <w:t>The Smart Complaint &amp; Grievance Redressal Portal demonstrates the effective application of full-stack software engineering, relational database normalization, and automated process management to solve a tangible, high-impact campus problem. By enforcing a strict 48-hour SLA countdown, multi-tier background escalation (Coordinator -&gt; HOD -&gt; Dean), and a closed-loop student rating lock, the application transforms grievance redressal from a neglected paper-based administrative task into an automated, transpare</w:t>
-      </w:r>
-      <w:r>
-        <w:rPr>
-          <w:rFonts w:ascii="Arial" w:hAnsi="Arial"/>
-          <w:color w:val="000000"/>
-          <w:sz w:val="24"/>
-        </w:rPr>
-        <w:t>nt, and accountable digital ecosystem. Building the system natively in pure Java SE 21 without bulky starter frameworks showcases deep mastery of core systems programming, socket handling, multithreading, and SQL database transactions.</w:t>
+        <w:t>The Smart Complaint &amp; Grievance Redressal Portal demonstrates the effective application of full-stack software engineering, relational database normalization, and automated process management to solve a tangible, high-impact campus problem. By enforcing a strict 48-hour SLA countdown, multi-tier background escalation (Coordinator -&gt; HOD -&gt; Dean), and a closed-loop student rating lock, the application transforms grievance redressal from a neglected paper-based administrative task into an automated, transparent, and accountable digital ecosystem. Building the system natively in pure Java SE 21 without bulky starter frameworks showcases deep mastery of core systems programming, socket handling, multithreading, and SQL database transactions.</w:t>
       </w:r>
     </w:p>
     <w:p>
@@ -13483,7 +14773,25 @@
           <w:color w:val="000000"/>
           <w:sz w:val="23"/>
         </w:rPr>
-        <w:t>Gained hands-on mastery over raw socket handling, request routing, and thread pool execution using Java SE built-in HttpServer.</w:t>
+        <w:t xml:space="preserve">Gained hands-on mastery over raw socket handling, request routing, and thread pool execution using Java SE built-in </w:t>
+      </w:r>
+      <w:proofErr w:type="spellStart"/>
+      <w:r>
+        <w:rPr>
+          <w:rFonts w:ascii="Arial" w:hAnsi="Arial"/>
+          <w:color w:val="000000"/>
+          <w:sz w:val="23"/>
+        </w:rPr>
+        <w:t>HttpServer</w:t>
+      </w:r>
+      <w:proofErr w:type="spellEnd"/>
+      <w:r>
+        <w:rPr>
+          <w:rFonts w:ascii="Arial" w:hAnsi="Arial"/>
+          <w:color w:val="000000"/>
+          <w:sz w:val="23"/>
+        </w:rPr>
+        <w:t>.</w:t>
       </w:r>
     </w:p>
     <w:p>
@@ -13549,7 +14857,43 @@
           <w:color w:val="000000"/>
           <w:sz w:val="23"/>
         </w:rPr>
-        <w:t>Implemented cryptographic security best practices including BCrypt password salting and positional PreparedStatement parameterization to prevent injection vulnerabilities.</w:t>
+        <w:t xml:space="preserve">Implemented cryptographic security best practices including </w:t>
+      </w:r>
+      <w:proofErr w:type="spellStart"/>
+      <w:r>
+        <w:rPr>
+          <w:rFonts w:ascii="Arial" w:hAnsi="Arial"/>
+          <w:color w:val="000000"/>
+          <w:sz w:val="23"/>
+        </w:rPr>
+        <w:t>BCrypt</w:t>
+      </w:r>
+      <w:proofErr w:type="spellEnd"/>
+      <w:r>
+        <w:rPr>
+          <w:rFonts w:ascii="Arial" w:hAnsi="Arial"/>
+          <w:color w:val="000000"/>
+          <w:sz w:val="23"/>
+        </w:rPr>
+        <w:t xml:space="preserve"> password salting and positional </w:t>
+      </w:r>
+      <w:proofErr w:type="spellStart"/>
+      <w:r>
+        <w:rPr>
+          <w:rFonts w:ascii="Arial" w:hAnsi="Arial"/>
+          <w:color w:val="000000"/>
+          <w:sz w:val="23"/>
+        </w:rPr>
+        <w:t>PreparedStatement</w:t>
+      </w:r>
+      <w:proofErr w:type="spellEnd"/>
+      <w:r>
+        <w:rPr>
+          <w:rFonts w:ascii="Arial" w:hAnsi="Arial"/>
+          <w:color w:val="000000"/>
+          <w:sz w:val="23"/>
+        </w:rPr>
+        <w:t xml:space="preserve"> parameterization to prevent injection vulnerabilities.</w:t>
       </w:r>
     </w:p>
     <w:p>
@@ -13767,15 +15111,8 @@
     </w:p>
     <w:p>
       <w:r>
-        <w:lastRenderedPageBreak/>
         <w:br w:type="page"/>
       </w:r>
-    </w:p>
-    <w:p>
-      <w:pPr>
-        <w:spacing w:before="360" w:after="280"/>
-        <w:jc w:val="center"/>
-      </w:pPr>
       <w:r>
         <w:rPr>
           <w:rFonts w:ascii="Arial" w:hAnsi="Arial"/>
@@ -13811,7 +15148,27 @@
           <w:color w:val="000000"/>
           <w:sz w:val="20"/>
         </w:rPr>
-        <w:t>Oracle Corporation. (2024). Java Platform, Standard Edition Documentation (JDK 21 LTS). com.sun.net.httpserver Package Specification. Oracle Technology Network.</w:t>
+        <w:t xml:space="preserve">Oracle Corporation. (2024). Java Platform, Standard Edition Documentation (JDK 21 LTS). </w:t>
+      </w:r>
+      <w:proofErr w:type="spellStart"/>
+      <w:proofErr w:type="gramStart"/>
+      <w:r>
+        <w:rPr>
+          <w:rFonts w:ascii="Arial" w:hAnsi="Arial"/>
+          <w:color w:val="000000"/>
+          <w:sz w:val="20"/>
+        </w:rPr>
+        <w:t>com.sun.net.httpserver</w:t>
+      </w:r>
+      <w:proofErr w:type="spellEnd"/>
+      <w:proofErr w:type="gramEnd"/>
+      <w:r>
+        <w:rPr>
+          <w:rFonts w:ascii="Arial" w:hAnsi="Arial"/>
+          <w:color w:val="000000"/>
+          <w:sz w:val="20"/>
+        </w:rPr>
+        <w:t xml:space="preserve"> Package Specification. Oracle Technology Network.</w:t>
       </w:r>
     </w:p>
     <w:p>
@@ -13825,7 +15182,25 @@
           <w:color w:val="000000"/>
           <w:sz w:val="20"/>
         </w:rPr>
-        <w:t>MySQL AB. (2024). MySQL 8.0 Reference Manual: InnoDB Storage Engine, Transaction Isolation and Foreign Key Constraints. Oracle Corporation.</w:t>
+        <w:t xml:space="preserve">MySQL AB. (2024). MySQL 8.0 Reference Manual: </w:t>
+      </w:r>
+      <w:proofErr w:type="spellStart"/>
+      <w:r>
+        <w:rPr>
+          <w:rFonts w:ascii="Arial" w:hAnsi="Arial"/>
+          <w:color w:val="000000"/>
+          <w:sz w:val="20"/>
+        </w:rPr>
+        <w:t>InnoDB</w:t>
+      </w:r>
+      <w:proofErr w:type="spellEnd"/>
+      <w:r>
+        <w:rPr>
+          <w:rFonts w:ascii="Arial" w:hAnsi="Arial"/>
+          <w:color w:val="000000"/>
+          <w:sz w:val="20"/>
+        </w:rPr>
+        <w:t xml:space="preserve"> Storage Engine, Transaction Isolation and Foreign Key Constraints. Oracle Corporation.</w:t>
       </w:r>
     </w:p>
     <w:p>
@@ -13839,7 +15214,25 @@
           <w:color w:val="000000"/>
           <w:sz w:val="20"/>
         </w:rPr>
-        <w:t>Provos, N., &amp; Mazières, D. (1999). A Future-Adaptable Password Scheme. In Proceedings of the FREENIX Track: 1999 USENIX Annual Technical Conference (pp. 81-91).</w:t>
+        <w:t xml:space="preserve">Provos, N., &amp; </w:t>
+      </w:r>
+      <w:proofErr w:type="spellStart"/>
+      <w:r>
+        <w:rPr>
+          <w:rFonts w:ascii="Arial" w:hAnsi="Arial"/>
+          <w:color w:val="000000"/>
+          <w:sz w:val="20"/>
+        </w:rPr>
+        <w:t>Mazières</w:t>
+      </w:r>
+      <w:proofErr w:type="spellEnd"/>
+      <w:r>
+        <w:rPr>
+          <w:rFonts w:ascii="Arial" w:hAnsi="Arial"/>
+          <w:color w:val="000000"/>
+          <w:sz w:val="20"/>
+        </w:rPr>
+        <w:t>, D. (1999). A Future-Adaptable Password Scheme. In Proceedings of the FREENIX Track: 1999 USENIX Annual Technical Conference (pp. 81-91).</w:t>
       </w:r>
     </w:p>
     <w:p>
@@ -13895,7 +15288,25 @@
           <w:color w:val="000000"/>
           <w:sz w:val="20"/>
         </w:rPr>
-        <w:t>McHugh, M. L. (2009). The odds ratio: calculation, usage, and interpretation. Biochemia Medica, 19(2), 120-126.</w:t>
+        <w:t xml:space="preserve">McHugh, M. L. (2009). The odds ratio: calculation, usage, and interpretation. </w:t>
+      </w:r>
+      <w:proofErr w:type="spellStart"/>
+      <w:r>
+        <w:rPr>
+          <w:rFonts w:ascii="Arial" w:hAnsi="Arial"/>
+          <w:color w:val="000000"/>
+          <w:sz w:val="20"/>
+        </w:rPr>
+        <w:t>Biochemia</w:t>
+      </w:r>
+      <w:proofErr w:type="spellEnd"/>
+      <w:r>
+        <w:rPr>
+          <w:rFonts w:ascii="Arial" w:hAnsi="Arial"/>
+          <w:color w:val="000000"/>
+          <w:sz w:val="20"/>
+        </w:rPr>
+        <w:t xml:space="preserve"> Medica, 19(2), 120-126.</w:t>
       </w:r>
     </w:p>
     <w:p>
@@ -13927,7 +15338,7 @@
       </w:r>
     </w:p>
     <w:sectPr>
-      <w:footerReference w:type="default" r:id="rId15"/>
+      <w:footerReference w:type="default" r:id="rId14"/>
       <w:pgSz w:w="11906" w:h="16838"/>
       <w:pgMar w:top="1440" w:right="1440" w:bottom="1440" w:left="1440" w:header="708" w:footer="708" w:gutter="0"/>
       <w:cols w:space="708"/>

</xml_diff>